<commit_message>
Second update on CIS 2423 Project Report
</commit_message>
<xml_diff>
--- a/CIS 2423_Project_Report_202420.docx
+++ b/CIS 2423_Project_Report_202420.docx
@@ -6155,8 +6155,8 @@
       <w:pPr>
         <w:pStyle w:val="Heading1"/>
       </w:pPr>
-      <w:bookmarkStart w:id="0" w:name="_Hlk137551000"/>
-      <w:bookmarkStart w:id="1" w:name="_Toc196655586"/>
+      <w:bookmarkStart w:id="0" w:name="_Toc196655586"/>
+      <w:bookmarkStart w:id="1" w:name="_Hlk137551000"/>
       <w:r>
         <w:lastRenderedPageBreak/>
         <w:t>CLO 1 -</w:t>
@@ -6167,7 +6167,7 @@
       <w:r>
         <w:t>Introduction to Data Analysis and Machine Learning</w:t>
       </w:r>
-      <w:bookmarkEnd w:id="1"/>
+      <w:bookmarkEnd w:id="0"/>
     </w:p>
     <w:p>
       <w:pPr>
@@ -12760,7 +12760,7 @@
         </w:rPr>
       </w:pPr>
       <w:bookmarkStart w:id="12" w:name="_Hlk137552981"/>
-      <w:bookmarkEnd w:id="0"/>
+      <w:bookmarkEnd w:id="1"/>
       <w:r>
         <w:rPr>
           <w:rFonts w:asciiTheme="minorBidi" w:hAnsiTheme="minorBidi"/>
@@ -14429,7 +14429,7 @@
           <w:lang w:val="en-AE"/>
         </w:rPr>
         <w:drawing>
-          <wp:inline distT="0" distB="0" distL="0" distR="0" wp14:anchorId="6E00C821" wp14:editId="28E566DC">
+          <wp:inline distT="0" distB="0" distL="0" distR="0" wp14:anchorId="6E00C821" wp14:editId="0ABC9213">
             <wp:extent cx="3223895" cy="2882900"/>
             <wp:effectExtent l="0" t="0" r="0" b="0"/>
             <wp:docPr id="1729929838" name="Picture 1" descr="A screen shot of a computer program&#10;&#10;AI-generated content may be incorrect."/>
@@ -20986,8 +20986,8 @@
       <w:pPr>
         <w:pStyle w:val="Heading1"/>
       </w:pPr>
-      <w:bookmarkStart w:id="13" w:name="_Hlk137554179"/>
-      <w:bookmarkStart w:id="14" w:name="_Toc196655597"/>
+      <w:bookmarkStart w:id="13" w:name="_Toc196655597"/>
+      <w:bookmarkStart w:id="14" w:name="_Hlk137554179"/>
       <w:bookmarkEnd w:id="12"/>
       <w:r>
         <w:t>CLO</w:t>
@@ -21008,7 +21008,7 @@
       <w:r>
         <w:t>Version Control</w:t>
       </w:r>
-      <w:bookmarkEnd w:id="14"/>
+      <w:bookmarkEnd w:id="13"/>
       <w:r>
         <w:t xml:space="preserve"> </w:t>
       </w:r>
@@ -21016,12 +21016,54 @@
     <w:p>
       <w:pPr>
         <w:pStyle w:val="Quote"/>
+        <w:rPr>
+          <w:rtl/>
+        </w:rPr>
       </w:pPr>
       <w:r>
         <w:t>1.        C</w:t>
       </w:r>
       <w:r>
         <w:t>reate a new repo for project in Git Hub</w:t>
+      </w:r>
+    </w:p>
+    <w:p>
+      <w:r>
+        <w:drawing>
+          <wp:inline distT="0" distB="0" distL="0" distR="0" wp14:anchorId="7D80B0E5" wp14:editId="554E11D5">
+            <wp:extent cx="5734050" cy="4133215"/>
+            <wp:effectExtent l="0" t="0" r="0" b="635"/>
+            <wp:docPr id="215275681" name="Picture 1" descr="A screenshot of a computer&#10;&#10;AI-generated content may be incorrect."/>
+            <wp:cNvGraphicFramePr>
+              <a:graphicFrameLocks xmlns:a="http://schemas.openxmlformats.org/drawingml/2006/main" noChangeAspect="1"/>
+            </wp:cNvGraphicFramePr>
+            <a:graphic xmlns:a="http://schemas.openxmlformats.org/drawingml/2006/main">
+              <a:graphicData uri="http://schemas.openxmlformats.org/drawingml/2006/picture">
+                <pic:pic xmlns:pic="http://schemas.openxmlformats.org/drawingml/2006/picture">
+                  <pic:nvPicPr>
+                    <pic:cNvPr id="215275681" name="Picture 1" descr="A screenshot of a computer&#10;&#10;AI-generated content may be incorrect."/>
+                    <pic:cNvPicPr/>
+                  </pic:nvPicPr>
+                  <pic:blipFill>
+                    <a:blip r:embed="rId47"/>
+                    <a:stretch>
+                      <a:fillRect/>
+                    </a:stretch>
+                  </pic:blipFill>
+                  <pic:spPr>
+                    <a:xfrm>
+                      <a:off x="0" y="0"/>
+                      <a:ext cx="5734050" cy="4133215"/>
+                    </a:xfrm>
+                    <a:prstGeom prst="rect">
+                      <a:avLst/>
+                    </a:prstGeom>
+                  </pic:spPr>
+                </pic:pic>
+              </a:graphicData>
+            </a:graphic>
+          </wp:inline>
+        </w:drawing>
       </w:r>
     </w:p>
     <w:p/>
@@ -21064,7 +21106,7 @@
                     <pic:cNvPicPr/>
                   </pic:nvPicPr>
                   <pic:blipFill>
-                    <a:blip r:embed="rId47"/>
+                    <a:blip r:embed="rId48"/>
                     <a:stretch>
                       <a:fillRect/>
                     </a:stretch>
@@ -21118,7 +21160,7 @@
                     <pic:cNvPicPr/>
                   </pic:nvPicPr>
                   <pic:blipFill>
-                    <a:blip r:embed="rId48"/>
+                    <a:blip r:embed="rId49"/>
                     <a:stretch>
                       <a:fillRect/>
                     </a:stretch>
@@ -21156,7 +21198,6 @@
         <w:rPr>
           <w:noProof/>
         </w:rPr>
-        <w:lastRenderedPageBreak/>
         <w:drawing>
           <wp:inline distT="0" distB="0" distL="0" distR="0" wp14:anchorId="22B7003A" wp14:editId="49D6E4FA">
             <wp:extent cx="5734050" cy="1110615"/>
@@ -21173,7 +21214,7 @@
                     <pic:cNvPicPr/>
                   </pic:nvPicPr>
                   <pic:blipFill>
-                    <a:blip r:embed="rId49"/>
+                    <a:blip r:embed="rId50"/>
                     <a:stretch>
                       <a:fillRect/>
                     </a:stretch>
@@ -21234,7 +21275,7 @@
                     <pic:cNvPicPr/>
                   </pic:nvPicPr>
                   <pic:blipFill>
-                    <a:blip r:embed="rId50"/>
+                    <a:blip r:embed="rId51"/>
                     <a:stretch>
                       <a:fillRect/>
                     </a:stretch>
@@ -21276,12 +21317,101 @@
           <w:rtl/>
         </w:rPr>
       </w:pPr>
+      <w:r>
+        <w:lastRenderedPageBreak/>
+        <w:drawing>
+          <wp:inline distT="0" distB="0" distL="0" distR="0" wp14:anchorId="4F2456CF" wp14:editId="13DFC606">
+            <wp:extent cx="5734050" cy="2779395"/>
+            <wp:effectExtent l="0" t="0" r="0" b="1905"/>
+            <wp:docPr id="1163371722" name="Picture 1" descr="A screen shot of a computer program&#10;&#10;AI-generated content may be incorrect."/>
+            <wp:cNvGraphicFramePr>
+              <a:graphicFrameLocks xmlns:a="http://schemas.openxmlformats.org/drawingml/2006/main" noChangeAspect="1"/>
+            </wp:cNvGraphicFramePr>
+            <a:graphic xmlns:a="http://schemas.openxmlformats.org/drawingml/2006/main">
+              <a:graphicData uri="http://schemas.openxmlformats.org/drawingml/2006/picture">
+                <pic:pic xmlns:pic="http://schemas.openxmlformats.org/drawingml/2006/picture">
+                  <pic:nvPicPr>
+                    <pic:cNvPr id="1163371722" name="Picture 1" descr="A screen shot of a computer program&#10;&#10;AI-generated content may be incorrect."/>
+                    <pic:cNvPicPr/>
+                  </pic:nvPicPr>
+                  <pic:blipFill>
+                    <a:blip r:embed="rId52"/>
+                    <a:stretch>
+                      <a:fillRect/>
+                    </a:stretch>
+                  </pic:blipFill>
+                  <pic:spPr>
+                    <a:xfrm>
+                      <a:off x="0" y="0"/>
+                      <a:ext cx="5734050" cy="2779395"/>
+                    </a:xfrm>
+                    <a:prstGeom prst="rect">
+                      <a:avLst/>
+                    </a:prstGeom>
+                  </pic:spPr>
+                </pic:pic>
+              </a:graphicData>
+            </a:graphic>
+          </wp:inline>
+        </w:drawing>
+      </w:r>
     </w:p>
     <w:p>
       <w:pPr>
+        <w:rPr>
+          <w:rtl/>
+        </w:rPr>
+      </w:pPr>
+      <w:r>
+        <w:drawing>
+          <wp:inline distT="0" distB="0" distL="0" distR="0" wp14:anchorId="3F3A1EFA" wp14:editId="4D30A04E">
+            <wp:extent cx="5734050" cy="2413000"/>
+            <wp:effectExtent l="0" t="0" r="0" b="6350"/>
+            <wp:docPr id="224652109" name="Picture 1" descr="A screenshot of a computer&#10;&#10;AI-generated content may be incorrect."/>
+            <wp:cNvGraphicFramePr>
+              <a:graphicFrameLocks xmlns:a="http://schemas.openxmlformats.org/drawingml/2006/main" noChangeAspect="1"/>
+            </wp:cNvGraphicFramePr>
+            <a:graphic xmlns:a="http://schemas.openxmlformats.org/drawingml/2006/main">
+              <a:graphicData uri="http://schemas.openxmlformats.org/drawingml/2006/picture">
+                <pic:pic xmlns:pic="http://schemas.openxmlformats.org/drawingml/2006/picture">
+                  <pic:nvPicPr>
+                    <pic:cNvPr id="224652109" name="Picture 1" descr="A screenshot of a computer&#10;&#10;AI-generated content may be incorrect."/>
+                    <pic:cNvPicPr/>
+                  </pic:nvPicPr>
+                  <pic:blipFill>
+                    <a:blip r:embed="rId53"/>
+                    <a:stretch>
+                      <a:fillRect/>
+                    </a:stretch>
+                  </pic:blipFill>
+                  <pic:spPr>
+                    <a:xfrm>
+                      <a:off x="0" y="0"/>
+                      <a:ext cx="5734050" cy="2413000"/>
+                    </a:xfrm>
+                    <a:prstGeom prst="rect">
+                      <a:avLst/>
+                    </a:prstGeom>
+                  </pic:spPr>
+                </pic:pic>
+              </a:graphicData>
+            </a:graphic>
+          </wp:inline>
+        </w:drawing>
+      </w:r>
+    </w:p>
+    <w:p>
+      <w:pPr>
+        <w:rPr>
+          <w:rtl/>
+        </w:rPr>
+      </w:pPr>
+    </w:p>
+    <w:p>
+      <w:pPr>
         <w:sectPr>
-          <w:headerReference w:type="default" r:id="rId51"/>
-          <w:footerReference w:type="default" r:id="rId52"/>
+          <w:headerReference w:type="default" r:id="rId54"/>
+          <w:footerReference w:type="default" r:id="rId55"/>
           <w:pgSz w:w="11910" w:h="16840"/>
           <w:pgMar w:top="2160" w:right="1440" w:bottom="1440" w:left="1440" w:header="720" w:footer="399" w:gutter="0"/>
           <w:cols w:space="720"/>
@@ -27382,7 +27512,7 @@
         <w:pStyle w:val="Heading2"/>
       </w:pPr>
       <w:bookmarkStart w:id="18" w:name="_Toc196655600"/>
-      <w:bookmarkEnd w:id="13"/>
+      <w:bookmarkEnd w:id="14"/>
       <w:r>
         <w:lastRenderedPageBreak/>
         <w:t>Individual Oral Presentation</w:t>
@@ -37545,27 +37675,6 @@
 </file>
 
 <file path=customXml/item1.xml><?xml version="1.0" encoding="utf-8"?>
-<?mso-contentType ?>
-<FormTemplates xmlns="http://schemas.microsoft.com/sharepoint/v3/contenttype/forms">
-  <Display>DocumentLibraryForm</Display>
-  <Edit>DocumentLibraryForm</Edit>
-  <New>DocumentLibraryForm</New>
-</FormTemplates>
-</file>
-
-<file path=customXml/item2.xml><?xml version="1.0" encoding="utf-8"?>
-<b:Sources xmlns:b="http://schemas.openxmlformats.org/officeDocument/2006/bibliography" xmlns="http://schemas.openxmlformats.org/officeDocument/2006/bibliography" SelectedStyle="\APASixthEditionOfficeOnline.xsl" StyleName="APA" Version="6"/>
-</file>
-
-<file path=customXml/item3.xml><?xml version="1.0" encoding="utf-8"?>
-<p:properties xmlns:p="http://schemas.microsoft.com/office/2006/metadata/properties" xmlns:xsi="http://www.w3.org/2001/XMLSchema-instance" xmlns:pc="http://schemas.microsoft.com/office/infopath/2007/PartnerControls">
-  <documentManagement>
-    <_activity xmlns="67227509-9eb1-40eb-a9dc-2b1f0b440866" xsi:nil="true"/>
-  </documentManagement>
-</p:properties>
-</file>
-
-<file path=customXml/item4.xml><?xml version="1.0" encoding="utf-8"?>
 <ct:contentTypeSchema xmlns:ct="http://schemas.microsoft.com/office/2006/metadata/contentType" xmlns:ma="http://schemas.microsoft.com/office/2006/metadata/properties/metaAttributes" ct:_="" ma:_="" ma:contentTypeName="Document" ma:contentTypeID="0x0101001074AB0691E0C34286CE2CA513530002" ma:contentTypeVersion="15" ma:contentTypeDescription="Create a new document." ma:contentTypeScope="" ma:versionID="f0c759b539abbf0a316c2cd776d6b479">
   <xsd:schema xmlns:xsd="http://www.w3.org/2001/XMLSchema" xmlns:xs="http://www.w3.org/2001/XMLSchema" xmlns:p="http://schemas.microsoft.com/office/2006/metadata/properties" xmlns:ns3="67227509-9eb1-40eb-a9dc-2b1f0b440866" xmlns:ns4="2b030002-75d5-425a-8890-637f4c7b85a2" targetNamespace="http://schemas.microsoft.com/office/2006/metadata/properties" ma:root="true" ma:fieldsID="e278cd2dd81ea2faf464af44bb1ceffd" ns3:_="" ns4:_="">
     <xsd:import namespace="67227509-9eb1-40eb-a9dc-2b1f0b440866"/>
@@ -37798,40 +37907,28 @@
 </ct:contentTypeSchema>
 </file>
 
-<file path=customXml/itemProps1.xml><?xml version="1.0" encoding="utf-8"?>
-<ds:datastoreItem xmlns:ds="http://schemas.openxmlformats.org/officeDocument/2006/customXml" ds:itemID="{63F85671-42FA-431E-8CF5-642144B106FC}">
-  <ds:schemaRefs>
-    <ds:schemaRef ds:uri="http://schemas.microsoft.com/sharepoint/v3/contenttype/forms"/>
-  </ds:schemaRefs>
-</ds:datastoreItem>
+<file path=customXml/item2.xml><?xml version="1.0" encoding="utf-8"?>
+<p:properties xmlns:p="http://schemas.microsoft.com/office/2006/metadata/properties" xmlns:xsi="http://www.w3.org/2001/XMLSchema-instance" xmlns:pc="http://schemas.microsoft.com/office/infopath/2007/PartnerControls">
+  <documentManagement>
+    <_activity xmlns="67227509-9eb1-40eb-a9dc-2b1f0b440866" xsi:nil="true"/>
+  </documentManagement>
+</p:properties>
 </file>
 
-<file path=customXml/itemProps2.xml><?xml version="1.0" encoding="utf-8"?>
-<ds:datastoreItem xmlns:ds="http://schemas.openxmlformats.org/officeDocument/2006/customXml" ds:itemID="{576F2EA0-5242-4D4E-994A-0DDDE5F79F7E}">
-  <ds:schemaRefs>
-    <ds:schemaRef ds:uri="http://schemas.openxmlformats.org/officeDocument/2006/bibliography"/>
-  </ds:schemaRefs>
-</ds:datastoreItem>
+<file path=customXml/item3.xml><?xml version="1.0" encoding="utf-8"?>
+<?mso-contentType ?>
+<FormTemplates xmlns="http://schemas.microsoft.com/sharepoint/v3/contenttype/forms">
+  <Display>DocumentLibraryForm</Display>
+  <Edit>DocumentLibraryForm</Edit>
+  <New>DocumentLibraryForm</New>
+</FormTemplates>
 </file>
 
-<file path=customXml/itemProps3.xml><?xml version="1.0" encoding="utf-8"?>
-<ds:datastoreItem xmlns:ds="http://schemas.openxmlformats.org/officeDocument/2006/customXml" ds:itemID="{91FD62C1-1F9E-4FFF-AD82-34935D97573B}">
-  <ds:schemaRefs>
-    <ds:schemaRef ds:uri="http://schemas.microsoft.com/office/2006/documentManagement/types"/>
-    <ds:schemaRef ds:uri="67227509-9eb1-40eb-a9dc-2b1f0b440866"/>
-    <ds:schemaRef ds:uri="http://schemas.openxmlformats.org/package/2006/metadata/core-properties"/>
-    <ds:schemaRef ds:uri="http://purl.org/dc/dcmitype/"/>
-    <ds:schemaRef ds:uri="http://www.w3.org/XML/1998/namespace"/>
-    <ds:schemaRef ds:uri="http://schemas.microsoft.com/office/infopath/2007/PartnerControls"/>
-    <ds:schemaRef ds:uri="2b030002-75d5-425a-8890-637f4c7b85a2"/>
-    <ds:schemaRef ds:uri="http://schemas.microsoft.com/office/2006/metadata/properties"/>
-    <ds:schemaRef ds:uri="http://purl.org/dc/terms/"/>
-    <ds:schemaRef ds:uri="http://purl.org/dc/elements/1.1/"/>
-  </ds:schemaRefs>
-</ds:datastoreItem>
+<file path=customXml/item4.xml><?xml version="1.0" encoding="utf-8"?>
+<b:Sources xmlns:b="http://schemas.openxmlformats.org/officeDocument/2006/bibliography" xmlns="http://schemas.openxmlformats.org/officeDocument/2006/bibliography" SelectedStyle="\APASixthEditionOfficeOnline.xsl" StyleName="APA" Version="6"/>
 </file>
 
-<file path=customXml/itemProps4.xml><?xml version="1.0" encoding="utf-8"?>
+<file path=customXml/itemProps1.xml><?xml version="1.0" encoding="utf-8"?>
 <ds:datastoreItem xmlns:ds="http://schemas.openxmlformats.org/officeDocument/2006/customXml" ds:itemID="{63FE3BEA-40C4-4DEE-A351-0A12CC7F254D}">
   <ds:schemaRefs>
     <ds:schemaRef ds:uri="http://schemas.microsoft.com/office/2006/metadata/contentType"/>
@@ -37848,4 +37945,30 @@
     <ds:schemaRef ds:uri="http://schemas.microsoft.com/internal/obd"/>
   </ds:schemaRefs>
 </ds:datastoreItem>
+</file>
+
+<file path=customXml/itemProps2.xml><?xml version="1.0" encoding="utf-8"?>
+<ds:datastoreItem xmlns:ds="http://schemas.openxmlformats.org/officeDocument/2006/customXml" ds:itemID="{91FD62C1-1F9E-4FFF-AD82-34935D97573B}">
+  <ds:schemaRefs>
+    <ds:schemaRef ds:uri="http://schemas.microsoft.com/office/2006/metadata/properties"/>
+    <ds:schemaRef ds:uri="http://schemas.microsoft.com/office/infopath/2007/PartnerControls"/>
+    <ds:schemaRef ds:uri="67227509-9eb1-40eb-a9dc-2b1f0b440866"/>
+  </ds:schemaRefs>
+</ds:datastoreItem>
+</file>
+
+<file path=customXml/itemProps3.xml><?xml version="1.0" encoding="utf-8"?>
+<ds:datastoreItem xmlns:ds="http://schemas.openxmlformats.org/officeDocument/2006/customXml" ds:itemID="{63F85671-42FA-431E-8CF5-642144B106FC}">
+  <ds:schemaRefs>
+    <ds:schemaRef ds:uri="http://schemas.microsoft.com/sharepoint/v3/contenttype/forms"/>
+  </ds:schemaRefs>
+</ds:datastoreItem>
+</file>
+
+<file path=customXml/itemProps4.xml><?xml version="1.0" encoding="utf-8"?>
+<ds:datastoreItem xmlns:ds="http://schemas.openxmlformats.org/officeDocument/2006/customXml" ds:itemID="{576F2EA0-5242-4D4E-994A-0DDDE5F79F7E}">
+  <ds:schemaRefs>
+    <ds:schemaRef ds:uri="http://schemas.openxmlformats.org/officeDocument/2006/bibliography"/>
+  </ds:schemaRefs>
+</ds:datastoreItem>
 </file>
</xml_diff>

<commit_message>
Updated final report with today's edits
</commit_message>
<xml_diff>
--- a/CIS 2423_Project_Report_202420.docx
+++ b/CIS 2423_Project_Report_202420.docx
@@ -5,7 +5,7 @@
     <w:p>
       <w:pPr>
         <w:pStyle w:val="paragraph"/>
-        <w:shd w:val="clear" w:color="auto" w:fill="D9D9D9"/>
+        <w:shd w:val="clear" w:color="auto" w:fill="D9D9D9" w:themeFill="background1" w:themeFillShade="D9"/>
         <w:spacing w:before="0" w:beforeAutospacing="0" w:after="0" w:afterAutospacing="0"/>
         <w:jc w:val="center"/>
         <w:textAlignment w:val="baseline"/>
@@ -15,18 +15,6 @@
           <w:szCs w:val="18"/>
         </w:rPr>
       </w:pPr>
-      <w:proofErr w:type="spellStart"/>
-      <w:proofErr w:type="gramStart"/>
-      <w:r>
-        <w:rPr>
-          <w:rStyle w:val="normaltextrun"/>
-          <w:rFonts w:ascii="Microsoft GothicNeo" w:eastAsia="Microsoft GothicNeo" w:hAnsi="Microsoft GothicNeo" w:cs="Microsoft GothicNeo"/>
-          <w:b/>
-          <w:bCs/>
-          <w:color w:val="4472C4"/>
-        </w:rPr>
-        <w:t>a</w:t>
-      </w:r>
       <w:r>
         <w:rPr>
           <w:rStyle w:val="normaltextrun"/>
@@ -35,19 +23,7 @@
           <w:bCs/>
           <w:color w:val="4472C4"/>
         </w:rPr>
-        <w:t>Course</w:t>
-      </w:r>
-      <w:proofErr w:type="spellEnd"/>
-      <w:proofErr w:type="gramEnd"/>
-      <w:r>
-        <w:rPr>
-          <w:rStyle w:val="normaltextrun"/>
-          <w:rFonts w:ascii="Microsoft GothicNeo" w:eastAsia="Microsoft GothicNeo" w:hAnsi="Microsoft GothicNeo" w:cs="Microsoft GothicNeo" w:hint="eastAsia"/>
-          <w:b/>
-          <w:bCs/>
-          <w:color w:val="4472C4"/>
-        </w:rPr>
-        <w:t xml:space="preserve"> Work Project Description and Rubric</w:t>
+        <w:t>Course Work Project Description and Rubric</w:t>
       </w:r>
       <w:r>
         <w:rPr>
@@ -7343,73 +7319,6 @@
         <w:shd w:val="clear" w:color="auto" w:fill="F7F7F7"/>
         <w:spacing w:after="0" w:line="285" w:lineRule="auto"/>
       </w:pPr>
-      <w:r>
-        <w:rPr>
-          <w:rFonts w:ascii="Consolas" w:eastAsia="Consolas" w:hAnsi="Consolas" w:cs="Consolas"/>
-          <w:color w:val="0000FF"/>
-        </w:rPr>
-        <w:t>def</w:t>
-      </w:r>
-      <w:r>
-        <w:rPr>
-          <w:rFonts w:ascii="Consolas" w:eastAsia="Consolas" w:hAnsi="Consolas" w:cs="Consolas"/>
-          <w:color w:val="000000" w:themeColor="text1"/>
-        </w:rPr>
-        <w:t xml:space="preserve"> </w:t>
-      </w:r>
-      <w:proofErr w:type="spellStart"/>
-      <w:r>
-        <w:rPr>
-          <w:rFonts w:ascii="Consolas" w:eastAsia="Consolas" w:hAnsi="Consolas" w:cs="Consolas"/>
-          <w:color w:val="795E26"/>
-        </w:rPr>
-        <w:t>Desc_</w:t>
-      </w:r>
-      <w:proofErr w:type="gramStart"/>
-      <w:r>
-        <w:rPr>
-          <w:rFonts w:ascii="Consolas" w:eastAsia="Consolas" w:hAnsi="Consolas" w:cs="Consolas"/>
-          <w:color w:val="795E26"/>
-        </w:rPr>
-        <w:t>stat</w:t>
-      </w:r>
-      <w:proofErr w:type="spellEnd"/>
-      <w:r>
-        <w:rPr>
-          <w:rFonts w:ascii="Consolas" w:eastAsia="Consolas" w:hAnsi="Consolas" w:cs="Consolas"/>
-          <w:color w:val="000000" w:themeColor="text1"/>
-        </w:rPr>
-        <w:t>(</w:t>
-      </w:r>
-      <w:proofErr w:type="gramEnd"/>
-      <w:r>
-        <w:rPr>
-          <w:rFonts w:ascii="Consolas" w:eastAsia="Consolas" w:hAnsi="Consolas" w:cs="Consolas"/>
-          <w:color w:val="001080"/>
-        </w:rPr>
-        <w:t>sample</w:t>
-      </w:r>
-      <w:r>
-        <w:rPr>
-          <w:rFonts w:ascii="Consolas" w:eastAsia="Consolas" w:hAnsi="Consolas" w:cs="Consolas"/>
-          <w:color w:val="000000" w:themeColor="text1"/>
-        </w:rPr>
-        <w:t xml:space="preserve">, </w:t>
-      </w:r>
-      <w:r>
-        <w:rPr>
-          <w:rFonts w:ascii="Consolas" w:eastAsia="Consolas" w:hAnsi="Consolas" w:cs="Consolas"/>
-          <w:color w:val="001080"/>
-        </w:rPr>
-        <w:t>var</w:t>
-      </w:r>
-      <w:r>
-        <w:rPr>
-          <w:rFonts w:ascii="Consolas" w:eastAsia="Consolas" w:hAnsi="Consolas" w:cs="Consolas"/>
-          <w:color w:val="000000" w:themeColor="text1"/>
-        </w:rPr>
-        <w:t>):</w:t>
-      </w:r>
     </w:p>
     <w:p>
       <w:pPr>
@@ -7419,25 +7328,69 @@
       <w:r>
         <w:rPr>
           <w:rFonts w:ascii="Consolas" w:eastAsia="Consolas" w:hAnsi="Consolas" w:cs="Consolas"/>
-          <w:color w:val="000000" w:themeColor="text1"/>
-        </w:rPr>
-        <w:t xml:space="preserve">    mean = sample[var</w:t>
+          <w:color w:val="0000FF"/>
+        </w:rPr>
+        <w:t>def</w:t>
+      </w:r>
+      <w:r>
+        <w:rPr>
+          <w:rFonts w:ascii="Consolas" w:eastAsia="Consolas" w:hAnsi="Consolas" w:cs="Consolas"/>
+          <w:color w:val="000000" w:themeColor="text1"/>
+        </w:rPr>
+        <w:t xml:space="preserve"> </w:t>
+      </w:r>
+      <w:proofErr w:type="spellStart"/>
+      <w:r>
+        <w:rPr>
+          <w:rFonts w:ascii="Consolas" w:eastAsia="Consolas" w:hAnsi="Consolas" w:cs="Consolas"/>
+          <w:color w:val="795E26"/>
+        </w:rPr>
+        <w:t>Desc_</w:t>
       </w:r>
       <w:proofErr w:type="gramStart"/>
       <w:r>
         <w:rPr>
           <w:rFonts w:ascii="Consolas" w:eastAsia="Consolas" w:hAnsi="Consolas" w:cs="Consolas"/>
-          <w:color w:val="000000" w:themeColor="text1"/>
-        </w:rPr>
-        <w:t>].mean</w:t>
+          <w:color w:val="795E26"/>
+        </w:rPr>
+        <w:t>stat</w:t>
+      </w:r>
+      <w:proofErr w:type="spellEnd"/>
+      <w:r>
+        <w:rPr>
+          <w:rFonts w:ascii="Consolas" w:eastAsia="Consolas" w:hAnsi="Consolas" w:cs="Consolas"/>
+          <w:color w:val="000000" w:themeColor="text1"/>
+        </w:rPr>
+        <w:t>(</w:t>
       </w:r>
       <w:proofErr w:type="gramEnd"/>
       <w:r>
         <w:rPr>
           <w:rFonts w:ascii="Consolas" w:eastAsia="Consolas" w:hAnsi="Consolas" w:cs="Consolas"/>
-          <w:color w:val="000000" w:themeColor="text1"/>
-        </w:rPr>
-        <w:t>()</w:t>
+          <w:color w:val="001080"/>
+        </w:rPr>
+        <w:t>sample</w:t>
+      </w:r>
+      <w:r>
+        <w:rPr>
+          <w:rFonts w:ascii="Consolas" w:eastAsia="Consolas" w:hAnsi="Consolas" w:cs="Consolas"/>
+          <w:color w:val="000000" w:themeColor="text1"/>
+        </w:rPr>
+        <w:t xml:space="preserve">, </w:t>
+      </w:r>
+      <w:r>
+        <w:rPr>
+          <w:rFonts w:ascii="Consolas" w:eastAsia="Consolas" w:hAnsi="Consolas" w:cs="Consolas"/>
+          <w:color w:val="001080"/>
+        </w:rPr>
+        <w:t>var</w:t>
+      </w:r>
+      <w:r>
+        <w:rPr>
+          <w:rFonts w:ascii="Consolas" w:eastAsia="Consolas" w:hAnsi="Consolas" w:cs="Consolas"/>
+          <w:color w:val="000000" w:themeColor="text1"/>
+        </w:rPr>
+        <w:t>):</w:t>
       </w:r>
     </w:p>
     <w:p>
@@ -7450,7 +7403,7 @@
           <w:rFonts w:ascii="Consolas" w:eastAsia="Consolas" w:hAnsi="Consolas" w:cs="Consolas"/>
           <w:color w:val="000000" w:themeColor="text1"/>
         </w:rPr>
-        <w:t xml:space="preserve">    median = sample[var</w:t>
+        <w:t xml:space="preserve">    mean = sample[var</w:t>
       </w:r>
       <w:proofErr w:type="gramStart"/>
       <w:r>
@@ -7458,7 +7411,7 @@
           <w:rFonts w:ascii="Consolas" w:eastAsia="Consolas" w:hAnsi="Consolas" w:cs="Consolas"/>
           <w:color w:val="000000" w:themeColor="text1"/>
         </w:rPr>
-        <w:t>].median</w:t>
+        <w:t>].mean</w:t>
       </w:r>
       <w:proofErr w:type="gramEnd"/>
       <w:r>
@@ -7479,6 +7432,35 @@
           <w:rFonts w:ascii="Consolas" w:eastAsia="Consolas" w:hAnsi="Consolas" w:cs="Consolas"/>
           <w:color w:val="000000" w:themeColor="text1"/>
         </w:rPr>
+        <w:t xml:space="preserve">    median = sample[var</w:t>
+      </w:r>
+      <w:proofErr w:type="gramStart"/>
+      <w:r>
+        <w:rPr>
+          <w:rFonts w:ascii="Consolas" w:eastAsia="Consolas" w:hAnsi="Consolas" w:cs="Consolas"/>
+          <w:color w:val="000000" w:themeColor="text1"/>
+        </w:rPr>
+        <w:t>].median</w:t>
+      </w:r>
+      <w:proofErr w:type="gramEnd"/>
+      <w:r>
+        <w:rPr>
+          <w:rFonts w:ascii="Consolas" w:eastAsia="Consolas" w:hAnsi="Consolas" w:cs="Consolas"/>
+          <w:color w:val="000000" w:themeColor="text1"/>
+        </w:rPr>
+        <w:t>()</w:t>
+      </w:r>
+    </w:p>
+    <w:p>
+      <w:pPr>
+        <w:shd w:val="clear" w:color="auto" w:fill="F7F7F7"/>
+        <w:spacing w:after="0" w:line="285" w:lineRule="auto"/>
+      </w:pPr>
+      <w:r>
+        <w:rPr>
+          <w:rFonts w:ascii="Consolas" w:eastAsia="Consolas" w:hAnsi="Consolas" w:cs="Consolas"/>
+          <w:color w:val="000000" w:themeColor="text1"/>
+        </w:rPr>
         <w:t xml:space="preserve">    mode = sample[var</w:t>
       </w:r>
       <w:proofErr w:type="gramStart"/>
@@ -8144,11 +8126,697 @@
           <w:rFonts w:ascii="Consolas" w:eastAsia="Consolas" w:hAnsi="Consolas" w:cs="Consolas"/>
           <w:color w:val="000000" w:themeColor="text1"/>
         </w:rPr>
+        <w:lastRenderedPageBreak/>
         <w:t xml:space="preserve">    summary = {</w:t>
       </w:r>
     </w:p>
     <w:p>
       <w:pPr>
+        <w:shd w:val="clear" w:color="auto" w:fill="F7F7F7"/>
+        <w:spacing w:after="0" w:line="285" w:lineRule="auto"/>
+      </w:pPr>
+      <w:r>
+        <w:rPr>
+          <w:rFonts w:ascii="Consolas" w:eastAsia="Consolas" w:hAnsi="Consolas" w:cs="Consolas"/>
+          <w:color w:val="000000" w:themeColor="text1"/>
+        </w:rPr>
+        <w:t xml:space="preserve">        </w:t>
+      </w:r>
+      <w:r>
+        <w:rPr>
+          <w:rFonts w:ascii="Consolas" w:eastAsia="Consolas" w:hAnsi="Consolas" w:cs="Consolas"/>
+          <w:color w:val="A31515"/>
+        </w:rPr>
+        <w:t>"Average"</w:t>
+      </w:r>
+      <w:r>
+        <w:rPr>
+          <w:rFonts w:ascii="Consolas" w:eastAsia="Consolas" w:hAnsi="Consolas" w:cs="Consolas"/>
+          <w:color w:val="000000" w:themeColor="text1"/>
+        </w:rPr>
+        <w:t>: mean,</w:t>
+      </w:r>
+    </w:p>
+    <w:p>
+      <w:pPr>
+        <w:shd w:val="clear" w:color="auto" w:fill="F7F7F7"/>
+        <w:spacing w:after="0" w:line="285" w:lineRule="auto"/>
+      </w:pPr>
+      <w:r>
+        <w:rPr>
+          <w:rFonts w:ascii="Consolas" w:eastAsia="Consolas" w:hAnsi="Consolas" w:cs="Consolas"/>
+          <w:color w:val="000000" w:themeColor="text1"/>
+        </w:rPr>
+        <w:t xml:space="preserve">        </w:t>
+      </w:r>
+      <w:r>
+        <w:rPr>
+          <w:rFonts w:ascii="Consolas" w:eastAsia="Consolas" w:hAnsi="Consolas" w:cs="Consolas"/>
+          <w:color w:val="A31515"/>
+        </w:rPr>
+        <w:t>"Median"</w:t>
+      </w:r>
+      <w:r>
+        <w:rPr>
+          <w:rFonts w:ascii="Consolas" w:eastAsia="Consolas" w:hAnsi="Consolas" w:cs="Consolas"/>
+          <w:color w:val="000000" w:themeColor="text1"/>
+        </w:rPr>
+        <w:t>: median,</w:t>
+      </w:r>
+    </w:p>
+    <w:p>
+      <w:pPr>
+        <w:shd w:val="clear" w:color="auto" w:fill="F7F7F7"/>
+        <w:spacing w:after="0" w:line="285" w:lineRule="auto"/>
+      </w:pPr>
+      <w:r>
+        <w:rPr>
+          <w:rFonts w:ascii="Consolas" w:eastAsia="Consolas" w:hAnsi="Consolas" w:cs="Consolas"/>
+          <w:color w:val="000000" w:themeColor="text1"/>
+        </w:rPr>
+        <w:t xml:space="preserve">        </w:t>
+      </w:r>
+      <w:r>
+        <w:rPr>
+          <w:rFonts w:ascii="Consolas" w:eastAsia="Consolas" w:hAnsi="Consolas" w:cs="Consolas"/>
+          <w:color w:val="A31515"/>
+        </w:rPr>
+        <w:t>"Mode"</w:t>
+      </w:r>
+      <w:r>
+        <w:rPr>
+          <w:rFonts w:ascii="Consolas" w:eastAsia="Consolas" w:hAnsi="Consolas" w:cs="Consolas"/>
+          <w:color w:val="000000" w:themeColor="text1"/>
+        </w:rPr>
+        <w:t>: mode,</w:t>
+      </w:r>
+    </w:p>
+    <w:p>
+      <w:pPr>
+        <w:shd w:val="clear" w:color="auto" w:fill="F7F7F7"/>
+        <w:spacing w:after="0" w:line="285" w:lineRule="auto"/>
+      </w:pPr>
+      <w:r>
+        <w:rPr>
+          <w:rFonts w:ascii="Consolas" w:eastAsia="Consolas" w:hAnsi="Consolas" w:cs="Consolas"/>
+          <w:color w:val="000000" w:themeColor="text1"/>
+        </w:rPr>
+        <w:t xml:space="preserve">        </w:t>
+      </w:r>
+      <w:r>
+        <w:rPr>
+          <w:rFonts w:ascii="Consolas" w:eastAsia="Consolas" w:hAnsi="Consolas" w:cs="Consolas"/>
+          <w:color w:val="A31515"/>
+        </w:rPr>
+        <w:t>"Minimum"</w:t>
+      </w:r>
+      <w:r>
+        <w:rPr>
+          <w:rFonts w:ascii="Consolas" w:eastAsia="Consolas" w:hAnsi="Consolas" w:cs="Consolas"/>
+          <w:color w:val="000000" w:themeColor="text1"/>
+        </w:rPr>
+        <w:t>: minimum,</w:t>
+      </w:r>
+    </w:p>
+    <w:p>
+      <w:pPr>
+        <w:shd w:val="clear" w:color="auto" w:fill="F7F7F7"/>
+        <w:spacing w:after="0" w:line="285" w:lineRule="auto"/>
+      </w:pPr>
+      <w:r>
+        <w:rPr>
+          <w:rFonts w:ascii="Consolas" w:eastAsia="Consolas" w:hAnsi="Consolas" w:cs="Consolas"/>
+          <w:color w:val="000000" w:themeColor="text1"/>
+        </w:rPr>
+        <w:t xml:space="preserve">        </w:t>
+      </w:r>
+      <w:r>
+        <w:rPr>
+          <w:rFonts w:ascii="Consolas" w:eastAsia="Consolas" w:hAnsi="Consolas" w:cs="Consolas"/>
+          <w:color w:val="A31515"/>
+        </w:rPr>
+        <w:t>"Maximum"</w:t>
+      </w:r>
+      <w:r>
+        <w:rPr>
+          <w:rFonts w:ascii="Consolas" w:eastAsia="Consolas" w:hAnsi="Consolas" w:cs="Consolas"/>
+          <w:color w:val="000000" w:themeColor="text1"/>
+        </w:rPr>
+        <w:t>: maximum,</w:t>
+      </w:r>
+    </w:p>
+    <w:p>
+      <w:pPr>
+        <w:shd w:val="clear" w:color="auto" w:fill="F7F7F7"/>
+        <w:spacing w:after="0" w:line="285" w:lineRule="auto"/>
+      </w:pPr>
+      <w:r>
+        <w:rPr>
+          <w:rFonts w:ascii="Consolas" w:eastAsia="Consolas" w:hAnsi="Consolas" w:cs="Consolas"/>
+          <w:color w:val="000000" w:themeColor="text1"/>
+        </w:rPr>
+        <w:t xml:space="preserve">        </w:t>
+      </w:r>
+      <w:r>
+        <w:rPr>
+          <w:rFonts w:ascii="Consolas" w:eastAsia="Consolas" w:hAnsi="Consolas" w:cs="Consolas"/>
+          <w:color w:val="A31515"/>
+        </w:rPr>
+        <w:t>"Range"</w:t>
+      </w:r>
+      <w:r>
+        <w:rPr>
+          <w:rFonts w:ascii="Consolas" w:eastAsia="Consolas" w:hAnsi="Consolas" w:cs="Consolas"/>
+          <w:color w:val="000000" w:themeColor="text1"/>
+        </w:rPr>
+        <w:t xml:space="preserve">: </w:t>
+      </w:r>
+      <w:proofErr w:type="spellStart"/>
+      <w:r>
+        <w:rPr>
+          <w:rFonts w:ascii="Consolas" w:eastAsia="Consolas" w:hAnsi="Consolas" w:cs="Consolas"/>
+          <w:color w:val="000000" w:themeColor="text1"/>
+        </w:rPr>
+        <w:t>range_value</w:t>
+      </w:r>
+      <w:proofErr w:type="spellEnd"/>
+      <w:r>
+        <w:rPr>
+          <w:rFonts w:ascii="Consolas" w:eastAsia="Consolas" w:hAnsi="Consolas" w:cs="Consolas"/>
+          <w:color w:val="000000" w:themeColor="text1"/>
+        </w:rPr>
+        <w:t>,</w:t>
+      </w:r>
+    </w:p>
+    <w:p>
+      <w:pPr>
+        <w:shd w:val="clear" w:color="auto" w:fill="F7F7F7"/>
+        <w:spacing w:after="0" w:line="285" w:lineRule="auto"/>
+      </w:pPr>
+      <w:r>
+        <w:rPr>
+          <w:rFonts w:ascii="Consolas" w:eastAsia="Consolas" w:hAnsi="Consolas" w:cs="Consolas"/>
+          <w:color w:val="000000" w:themeColor="text1"/>
+        </w:rPr>
+        <w:t xml:space="preserve">        </w:t>
+      </w:r>
+      <w:r>
+        <w:rPr>
+          <w:rFonts w:ascii="Consolas" w:eastAsia="Consolas" w:hAnsi="Consolas" w:cs="Consolas"/>
+          <w:color w:val="A31515"/>
+        </w:rPr>
+        <w:t>"Std Dev"</w:t>
+      </w:r>
+      <w:r>
+        <w:rPr>
+          <w:rFonts w:ascii="Consolas" w:eastAsia="Consolas" w:hAnsi="Consolas" w:cs="Consolas"/>
+          <w:color w:val="000000" w:themeColor="text1"/>
+        </w:rPr>
+        <w:t xml:space="preserve">: </w:t>
+      </w:r>
+      <w:proofErr w:type="spellStart"/>
+      <w:r>
+        <w:rPr>
+          <w:rFonts w:ascii="Consolas" w:eastAsia="Consolas" w:hAnsi="Consolas" w:cs="Consolas"/>
+          <w:color w:val="000000" w:themeColor="text1"/>
+        </w:rPr>
+        <w:t>std_dev</w:t>
+      </w:r>
+      <w:proofErr w:type="spellEnd"/>
+      <w:r>
+        <w:rPr>
+          <w:rFonts w:ascii="Consolas" w:eastAsia="Consolas" w:hAnsi="Consolas" w:cs="Consolas"/>
+          <w:color w:val="000000" w:themeColor="text1"/>
+        </w:rPr>
+        <w:t>,</w:t>
+      </w:r>
+    </w:p>
+    <w:p>
+      <w:pPr>
+        <w:shd w:val="clear" w:color="auto" w:fill="F7F7F7"/>
+        <w:spacing w:after="0" w:line="285" w:lineRule="auto"/>
+      </w:pPr>
+      <w:r>
+        <w:rPr>
+          <w:rFonts w:ascii="Consolas" w:eastAsia="Consolas" w:hAnsi="Consolas" w:cs="Consolas"/>
+          <w:color w:val="000000" w:themeColor="text1"/>
+        </w:rPr>
+        <w:t xml:space="preserve">        </w:t>
+      </w:r>
+      <w:r>
+        <w:rPr>
+          <w:rFonts w:ascii="Consolas" w:eastAsia="Consolas" w:hAnsi="Consolas" w:cs="Consolas"/>
+          <w:color w:val="A31515"/>
+        </w:rPr>
+        <w:t>"Variance"</w:t>
+      </w:r>
+      <w:r>
+        <w:rPr>
+          <w:rFonts w:ascii="Consolas" w:eastAsia="Consolas" w:hAnsi="Consolas" w:cs="Consolas"/>
+          <w:color w:val="000000" w:themeColor="text1"/>
+        </w:rPr>
+        <w:t>: variance,</w:t>
+      </w:r>
+    </w:p>
+    <w:p>
+      <w:pPr>
+        <w:shd w:val="clear" w:color="auto" w:fill="F7F7F7"/>
+        <w:spacing w:after="0" w:line="285" w:lineRule="auto"/>
+      </w:pPr>
+      <w:r>
+        <w:rPr>
+          <w:rFonts w:ascii="Consolas" w:eastAsia="Consolas" w:hAnsi="Consolas" w:cs="Consolas"/>
+          <w:color w:val="000000" w:themeColor="text1"/>
+        </w:rPr>
+        <w:t xml:space="preserve">        </w:t>
+      </w:r>
+      <w:r>
+        <w:rPr>
+          <w:rFonts w:ascii="Consolas" w:eastAsia="Consolas" w:hAnsi="Consolas" w:cs="Consolas"/>
+          <w:color w:val="A31515"/>
+        </w:rPr>
+        <w:t>"Skewness"</w:t>
+      </w:r>
+      <w:r>
+        <w:rPr>
+          <w:rFonts w:ascii="Consolas" w:eastAsia="Consolas" w:hAnsi="Consolas" w:cs="Consolas"/>
+          <w:color w:val="000000" w:themeColor="text1"/>
+        </w:rPr>
+        <w:t>: skew,</w:t>
+      </w:r>
+    </w:p>
+    <w:p>
+      <w:pPr>
+        <w:shd w:val="clear" w:color="auto" w:fill="F7F7F7"/>
+        <w:spacing w:after="0" w:line="285" w:lineRule="auto"/>
+      </w:pPr>
+      <w:r>
+        <w:rPr>
+          <w:rFonts w:ascii="Consolas" w:eastAsia="Consolas" w:hAnsi="Consolas" w:cs="Consolas"/>
+          <w:color w:val="000000" w:themeColor="text1"/>
+        </w:rPr>
+        <w:t xml:space="preserve">        </w:t>
+      </w:r>
+      <w:r>
+        <w:rPr>
+          <w:rFonts w:ascii="Consolas" w:eastAsia="Consolas" w:hAnsi="Consolas" w:cs="Consolas"/>
+          <w:color w:val="A31515"/>
+        </w:rPr>
+        <w:t>"Kurtosis"</w:t>
+      </w:r>
+      <w:r>
+        <w:rPr>
+          <w:rFonts w:ascii="Consolas" w:eastAsia="Consolas" w:hAnsi="Consolas" w:cs="Consolas"/>
+          <w:color w:val="000000" w:themeColor="text1"/>
+        </w:rPr>
+        <w:t>: kurtosis,</w:t>
+      </w:r>
+    </w:p>
+    <w:p>
+      <w:pPr>
+        <w:shd w:val="clear" w:color="auto" w:fill="F7F7F7"/>
+        <w:spacing w:after="0" w:line="285" w:lineRule="auto"/>
+      </w:pPr>
+      <w:r>
+        <w:rPr>
+          <w:rFonts w:ascii="Consolas" w:eastAsia="Consolas" w:hAnsi="Consolas" w:cs="Consolas"/>
+          <w:color w:val="000000" w:themeColor="text1"/>
+        </w:rPr>
+        <w:t xml:space="preserve">        </w:t>
+      </w:r>
+      <w:r>
+        <w:rPr>
+          <w:rFonts w:ascii="Consolas" w:eastAsia="Consolas" w:hAnsi="Consolas" w:cs="Consolas"/>
+          <w:color w:val="A31515"/>
+        </w:rPr>
+        <w:t>"Minimum Quartile"</w:t>
+      </w:r>
+      <w:r>
+        <w:rPr>
+          <w:rFonts w:ascii="Consolas" w:eastAsia="Consolas" w:hAnsi="Consolas" w:cs="Consolas"/>
+          <w:color w:val="000000" w:themeColor="text1"/>
+        </w:rPr>
+        <w:t xml:space="preserve">: </w:t>
+      </w:r>
+      <w:proofErr w:type="gramStart"/>
+      <w:r>
+        <w:rPr>
+          <w:rFonts w:ascii="Consolas" w:eastAsia="Consolas" w:hAnsi="Consolas" w:cs="Consolas"/>
+          <w:color w:val="000000" w:themeColor="text1"/>
+        </w:rPr>
+        <w:t>Quart[</w:t>
+      </w:r>
+      <w:proofErr w:type="gramEnd"/>
+      <w:r>
+        <w:rPr>
+          <w:rFonts w:ascii="Consolas" w:eastAsia="Consolas" w:hAnsi="Consolas" w:cs="Consolas"/>
+          <w:color w:val="116644"/>
+        </w:rPr>
+        <w:t>0</w:t>
+      </w:r>
+      <w:r>
+        <w:rPr>
+          <w:rFonts w:ascii="Consolas" w:eastAsia="Consolas" w:hAnsi="Consolas" w:cs="Consolas"/>
+          <w:color w:val="000000" w:themeColor="text1"/>
+        </w:rPr>
+        <w:t>],</w:t>
+      </w:r>
+    </w:p>
+    <w:p>
+      <w:pPr>
+        <w:shd w:val="clear" w:color="auto" w:fill="F7F7F7"/>
+        <w:spacing w:after="0" w:line="285" w:lineRule="auto"/>
+      </w:pPr>
+      <w:r>
+        <w:rPr>
+          <w:rFonts w:ascii="Consolas" w:eastAsia="Consolas" w:hAnsi="Consolas" w:cs="Consolas"/>
+          <w:color w:val="000000" w:themeColor="text1"/>
+        </w:rPr>
+        <w:t xml:space="preserve">        </w:t>
+      </w:r>
+      <w:r>
+        <w:rPr>
+          <w:rFonts w:ascii="Consolas" w:eastAsia="Consolas" w:hAnsi="Consolas" w:cs="Consolas"/>
+          <w:color w:val="A31515"/>
+        </w:rPr>
+        <w:t>"25th Percentile"</w:t>
+      </w:r>
+      <w:r>
+        <w:rPr>
+          <w:rFonts w:ascii="Consolas" w:eastAsia="Consolas" w:hAnsi="Consolas" w:cs="Consolas"/>
+          <w:color w:val="000000" w:themeColor="text1"/>
+        </w:rPr>
+        <w:t xml:space="preserve">: </w:t>
+      </w:r>
+      <w:proofErr w:type="gramStart"/>
+      <w:r>
+        <w:rPr>
+          <w:rFonts w:ascii="Consolas" w:eastAsia="Consolas" w:hAnsi="Consolas" w:cs="Consolas"/>
+          <w:color w:val="000000" w:themeColor="text1"/>
+        </w:rPr>
+        <w:t>Quart[</w:t>
+      </w:r>
+      <w:proofErr w:type="gramEnd"/>
+      <w:r>
+        <w:rPr>
+          <w:rFonts w:ascii="Consolas" w:eastAsia="Consolas" w:hAnsi="Consolas" w:cs="Consolas"/>
+          <w:color w:val="116644"/>
+        </w:rPr>
+        <w:t>1</w:t>
+      </w:r>
+      <w:r>
+        <w:rPr>
+          <w:rFonts w:ascii="Consolas" w:eastAsia="Consolas" w:hAnsi="Consolas" w:cs="Consolas"/>
+          <w:color w:val="000000" w:themeColor="text1"/>
+        </w:rPr>
+        <w:t>],</w:t>
+      </w:r>
+    </w:p>
+    <w:p>
+      <w:pPr>
+        <w:shd w:val="clear" w:color="auto" w:fill="F7F7F7"/>
+        <w:spacing w:after="0" w:line="285" w:lineRule="auto"/>
+      </w:pPr>
+      <w:r>
+        <w:rPr>
+          <w:rFonts w:ascii="Consolas" w:eastAsia="Consolas" w:hAnsi="Consolas" w:cs="Consolas"/>
+          <w:color w:val="000000" w:themeColor="text1"/>
+        </w:rPr>
+        <w:t xml:space="preserve">        </w:t>
+      </w:r>
+      <w:r>
+        <w:rPr>
+          <w:rFonts w:ascii="Consolas" w:eastAsia="Consolas" w:hAnsi="Consolas" w:cs="Consolas"/>
+          <w:color w:val="A31515"/>
+        </w:rPr>
+        <w:t>"50th Percentile"</w:t>
+      </w:r>
+      <w:r>
+        <w:rPr>
+          <w:rFonts w:ascii="Consolas" w:eastAsia="Consolas" w:hAnsi="Consolas" w:cs="Consolas"/>
+          <w:color w:val="000000" w:themeColor="text1"/>
+        </w:rPr>
+        <w:t xml:space="preserve">: </w:t>
+      </w:r>
+      <w:proofErr w:type="gramStart"/>
+      <w:r>
+        <w:rPr>
+          <w:rFonts w:ascii="Consolas" w:eastAsia="Consolas" w:hAnsi="Consolas" w:cs="Consolas"/>
+          <w:color w:val="000000" w:themeColor="text1"/>
+        </w:rPr>
+        <w:t>Quart[</w:t>
+      </w:r>
+      <w:proofErr w:type="gramEnd"/>
+      <w:r>
+        <w:rPr>
+          <w:rFonts w:ascii="Consolas" w:eastAsia="Consolas" w:hAnsi="Consolas" w:cs="Consolas"/>
+          <w:color w:val="116644"/>
+        </w:rPr>
+        <w:t>2</w:t>
+      </w:r>
+      <w:r>
+        <w:rPr>
+          <w:rFonts w:ascii="Consolas" w:eastAsia="Consolas" w:hAnsi="Consolas" w:cs="Consolas"/>
+          <w:color w:val="000000" w:themeColor="text1"/>
+        </w:rPr>
+        <w:t>],</w:t>
+      </w:r>
+    </w:p>
+    <w:p>
+      <w:pPr>
+        <w:shd w:val="clear" w:color="auto" w:fill="F7F7F7"/>
+        <w:spacing w:after="0" w:line="285" w:lineRule="auto"/>
+      </w:pPr>
+      <w:r>
+        <w:rPr>
+          <w:rFonts w:ascii="Consolas" w:eastAsia="Consolas" w:hAnsi="Consolas" w:cs="Consolas"/>
+          <w:color w:val="000000" w:themeColor="text1"/>
+        </w:rPr>
+        <w:t xml:space="preserve">        </w:t>
+      </w:r>
+      <w:r>
+        <w:rPr>
+          <w:rFonts w:ascii="Consolas" w:eastAsia="Consolas" w:hAnsi="Consolas" w:cs="Consolas"/>
+          <w:color w:val="A31515"/>
+        </w:rPr>
+        <w:t>"75th Percentile"</w:t>
+      </w:r>
+      <w:r>
+        <w:rPr>
+          <w:rFonts w:ascii="Consolas" w:eastAsia="Consolas" w:hAnsi="Consolas" w:cs="Consolas"/>
+          <w:color w:val="000000" w:themeColor="text1"/>
+        </w:rPr>
+        <w:t xml:space="preserve">: </w:t>
+      </w:r>
+      <w:proofErr w:type="gramStart"/>
+      <w:r>
+        <w:rPr>
+          <w:rFonts w:ascii="Consolas" w:eastAsia="Consolas" w:hAnsi="Consolas" w:cs="Consolas"/>
+          <w:color w:val="000000" w:themeColor="text1"/>
+        </w:rPr>
+        <w:t>Quart[</w:t>
+      </w:r>
+      <w:proofErr w:type="gramEnd"/>
+      <w:r>
+        <w:rPr>
+          <w:rFonts w:ascii="Consolas" w:eastAsia="Consolas" w:hAnsi="Consolas" w:cs="Consolas"/>
+          <w:color w:val="116644"/>
+        </w:rPr>
+        <w:t>3</w:t>
+      </w:r>
+      <w:r>
+        <w:rPr>
+          <w:rFonts w:ascii="Consolas" w:eastAsia="Consolas" w:hAnsi="Consolas" w:cs="Consolas"/>
+          <w:color w:val="000000" w:themeColor="text1"/>
+        </w:rPr>
+        <w:t>],</w:t>
+      </w:r>
+    </w:p>
+    <w:p>
+      <w:pPr>
+        <w:shd w:val="clear" w:color="auto" w:fill="F7F7F7"/>
+        <w:spacing w:after="0" w:line="285" w:lineRule="auto"/>
+      </w:pPr>
+      <w:r>
+        <w:rPr>
+          <w:rFonts w:ascii="Consolas" w:eastAsia="Consolas" w:hAnsi="Consolas" w:cs="Consolas"/>
+          <w:color w:val="000000" w:themeColor="text1"/>
+        </w:rPr>
+        <w:t xml:space="preserve">        </w:t>
+      </w:r>
+      <w:r>
+        <w:rPr>
+          <w:rFonts w:ascii="Consolas" w:eastAsia="Consolas" w:hAnsi="Consolas" w:cs="Consolas"/>
+          <w:color w:val="A31515"/>
+        </w:rPr>
+        <w:t>"Maximum Quartile"</w:t>
+      </w:r>
+      <w:r>
+        <w:rPr>
+          <w:rFonts w:ascii="Consolas" w:eastAsia="Consolas" w:hAnsi="Consolas" w:cs="Consolas"/>
+          <w:color w:val="000000" w:themeColor="text1"/>
+        </w:rPr>
+        <w:t xml:space="preserve">: </w:t>
+      </w:r>
+      <w:proofErr w:type="gramStart"/>
+      <w:r>
+        <w:rPr>
+          <w:rFonts w:ascii="Consolas" w:eastAsia="Consolas" w:hAnsi="Consolas" w:cs="Consolas"/>
+          <w:color w:val="000000" w:themeColor="text1"/>
+        </w:rPr>
+        <w:t>Quart[</w:t>
+      </w:r>
+      <w:proofErr w:type="gramEnd"/>
+      <w:r>
+        <w:rPr>
+          <w:rFonts w:ascii="Consolas" w:eastAsia="Consolas" w:hAnsi="Consolas" w:cs="Consolas"/>
+          <w:color w:val="116644"/>
+        </w:rPr>
+        <w:t>4</w:t>
+      </w:r>
+      <w:r>
+        <w:rPr>
+          <w:rFonts w:ascii="Consolas" w:eastAsia="Consolas" w:hAnsi="Consolas" w:cs="Consolas"/>
+          <w:color w:val="000000" w:themeColor="text1"/>
+        </w:rPr>
+        <w:t>],</w:t>
+      </w:r>
+    </w:p>
+    <w:p>
+      <w:pPr>
+        <w:shd w:val="clear" w:color="auto" w:fill="F7F7F7"/>
+        <w:spacing w:after="0" w:line="285" w:lineRule="auto"/>
+      </w:pPr>
+      <w:r>
+        <w:rPr>
+          <w:rFonts w:ascii="Consolas" w:eastAsia="Consolas" w:hAnsi="Consolas" w:cs="Consolas"/>
+          <w:color w:val="000000" w:themeColor="text1"/>
+        </w:rPr>
+        <w:t xml:space="preserve">        </w:t>
+      </w:r>
+      <w:r>
+        <w:rPr>
+          <w:rFonts w:ascii="Consolas" w:eastAsia="Consolas" w:hAnsi="Consolas" w:cs="Consolas"/>
+          <w:color w:val="A31515"/>
+        </w:rPr>
+        <w:t>"Inter Quartile Range"</w:t>
+      </w:r>
+      <w:r>
+        <w:rPr>
+          <w:rFonts w:ascii="Consolas" w:eastAsia="Consolas" w:hAnsi="Consolas" w:cs="Consolas"/>
+          <w:color w:val="000000" w:themeColor="text1"/>
+        </w:rPr>
+        <w:t xml:space="preserve">: </w:t>
+      </w:r>
+      <w:proofErr w:type="gramStart"/>
+      <w:r>
+        <w:rPr>
+          <w:rFonts w:ascii="Consolas" w:eastAsia="Consolas" w:hAnsi="Consolas" w:cs="Consolas"/>
+          <w:color w:val="000000" w:themeColor="text1"/>
+        </w:rPr>
+        <w:t>Quart[</w:t>
+      </w:r>
+      <w:proofErr w:type="gramEnd"/>
+      <w:r>
+        <w:rPr>
+          <w:rFonts w:ascii="Consolas" w:eastAsia="Consolas" w:hAnsi="Consolas" w:cs="Consolas"/>
+          <w:color w:val="116644"/>
+        </w:rPr>
+        <w:t>5</w:t>
+      </w:r>
+      <w:r>
+        <w:rPr>
+          <w:rFonts w:ascii="Consolas" w:eastAsia="Consolas" w:hAnsi="Consolas" w:cs="Consolas"/>
+          <w:color w:val="000000" w:themeColor="text1"/>
+        </w:rPr>
+        <w:t>],</w:t>
+      </w:r>
+    </w:p>
+    <w:p>
+      <w:pPr>
+        <w:shd w:val="clear" w:color="auto" w:fill="F7F7F7"/>
+        <w:spacing w:after="0" w:line="285" w:lineRule="auto"/>
+      </w:pPr>
+      <w:r>
+        <w:rPr>
+          <w:rFonts w:ascii="Consolas" w:eastAsia="Consolas" w:hAnsi="Consolas" w:cs="Consolas"/>
+          <w:color w:val="000000" w:themeColor="text1"/>
+        </w:rPr>
+        <w:t xml:space="preserve">        </w:t>
+      </w:r>
+      <w:r>
+        <w:rPr>
+          <w:rFonts w:ascii="Consolas" w:eastAsia="Consolas" w:hAnsi="Consolas" w:cs="Consolas"/>
+          <w:color w:val="A31515"/>
+        </w:rPr>
+        <w:t>"Count"</w:t>
+      </w:r>
+      <w:r>
+        <w:rPr>
+          <w:rFonts w:ascii="Consolas" w:eastAsia="Consolas" w:hAnsi="Consolas" w:cs="Consolas"/>
+          <w:color w:val="000000" w:themeColor="text1"/>
+        </w:rPr>
+        <w:t>: count</w:t>
+      </w:r>
+    </w:p>
+    <w:p>
+      <w:pPr>
+        <w:shd w:val="clear" w:color="auto" w:fill="F7F7F7"/>
+        <w:spacing w:after="0" w:line="285" w:lineRule="auto"/>
+      </w:pPr>
+      <w:r>
+        <w:rPr>
+          <w:rFonts w:ascii="Consolas" w:eastAsia="Consolas" w:hAnsi="Consolas" w:cs="Consolas"/>
+          <w:color w:val="000000" w:themeColor="text1"/>
+        </w:rPr>
+        <w:t xml:space="preserve">    }</w:t>
+      </w:r>
+    </w:p>
+    <w:p>
+      <w:pPr>
+        <w:shd w:val="clear" w:color="auto" w:fill="F7F7F7"/>
+        <w:spacing w:after="0" w:line="285" w:lineRule="auto"/>
+      </w:pPr>
+    </w:p>
+    <w:p>
+      <w:pPr>
+        <w:shd w:val="clear" w:color="auto" w:fill="F7F7F7"/>
+        <w:spacing w:after="0" w:line="285" w:lineRule="auto"/>
+      </w:pPr>
+      <w:r>
+        <w:rPr>
+          <w:rFonts w:ascii="Consolas" w:eastAsia="Consolas" w:hAnsi="Consolas" w:cs="Consolas"/>
+          <w:color w:val="000000" w:themeColor="text1"/>
+        </w:rPr>
+        <w:t xml:space="preserve">    </w:t>
+      </w:r>
+      <w:r>
+        <w:rPr>
+          <w:rFonts w:ascii="Consolas" w:eastAsia="Consolas" w:hAnsi="Consolas" w:cs="Consolas"/>
+          <w:color w:val="AF00DB"/>
+        </w:rPr>
+        <w:t>return</w:t>
+      </w:r>
+      <w:r>
+        <w:rPr>
+          <w:rFonts w:ascii="Consolas" w:eastAsia="Consolas" w:hAnsi="Consolas" w:cs="Consolas"/>
+          <w:color w:val="000000" w:themeColor="text1"/>
+        </w:rPr>
+        <w:t xml:space="preserve"> summary</w:t>
+      </w:r>
+    </w:p>
+    <w:p>
+      <w:pPr>
+        <w:shd w:val="clear" w:color="auto" w:fill="F7F7F7"/>
+        <w:spacing w:after="0" w:line="285" w:lineRule="auto"/>
+        <w:rPr>
+          <w:rFonts w:ascii="Consolas" w:eastAsia="Consolas" w:hAnsi="Consolas" w:cs="Consolas"/>
+          <w:color w:val="000000" w:themeColor="text1"/>
+        </w:rPr>
+      </w:pPr>
+    </w:p>
+    <w:p>
+      <w:pPr>
         <w:pStyle w:val="Quote"/>
         <w:rPr>
           <w:rFonts w:asciiTheme="minorBidi" w:hAnsiTheme="minorBidi"/>
@@ -8158,7 +8826,6 @@
         <w:rPr>
           <w:rFonts w:asciiTheme="minorBidi" w:hAnsiTheme="minorBidi"/>
         </w:rPr>
-        <w:lastRenderedPageBreak/>
         <w:t xml:space="preserve">7- </w:t>
       </w:r>
       <w:r>
@@ -8640,6 +9307,7 @@
           <w:iCs w:val="0"/>
           <w:color w:val="1F1F1F"/>
         </w:rPr>
+        <w:lastRenderedPageBreak/>
         <w:t>Descriptive Statistics for Reading Score: {'Average': np.float64(68.99333333333334), 'Median': 71.0, 'Mode': np.int64(66), 'Minimum': 17, 'Maximum': 100, 'Range': 83, 'Std Dev': 15.091442380025168, 'Variance': 227.75163310961972, 'Skewness': np.float64(-0.3804006400109997), 'Kurtosis': np.float64(0.25771641687154156), 'Minimum Quartile': np.float64(17.0), '25th Percentile': np.float64(58.25), '50th Percentile': np.float64(71.0), '75th Percentile': np.float64(79.75), 'Maximum Quartile': np.float64(100.0), 'Inter Quartile Range': np.float64(21.5), 'Count': np.int64(150)}</w:t>
       </w:r>
     </w:p>
@@ -8843,7 +9511,6 @@
         <w:rPr>
           <w:rFonts w:asciiTheme="minorBidi" w:hAnsiTheme="minorBidi"/>
         </w:rPr>
-        <w:lastRenderedPageBreak/>
         <w:t xml:space="preserve">8- </w:t>
       </w:r>
       <w:r>
@@ -8992,6 +9659,7 @@
         </w:tabs>
       </w:pPr>
       <w:r>
+        <w:lastRenderedPageBreak/>
         <w:tab/>
       </w:r>
     </w:p>
@@ -10839,7 +11507,6 @@
         <w:rPr>
           <w:noProof/>
         </w:rPr>
-        <w:lastRenderedPageBreak/>
         <w:drawing>
           <wp:anchor distT="0" distB="0" distL="114300" distR="114300" simplePos="0" relativeHeight="251658240" behindDoc="1" locked="0" layoutInCell="1" allowOverlap="1" wp14:anchorId="3D8C39A4" wp14:editId="774A5018">
             <wp:simplePos x="0" y="0"/>
@@ -11092,6 +11759,7 @@
           <w:iCs w:val="0"/>
           <w:color w:val="1F1F1F"/>
         </w:rPr>
+        <w:lastRenderedPageBreak/>
         <w:t xml:space="preserve">Output: </w:t>
       </w:r>
     </w:p>
@@ -11328,7 +11996,6 @@
           <w:rFonts w:ascii="Consolas" w:eastAsia="Consolas" w:hAnsi="Consolas" w:cs="Consolas"/>
           <w:color w:val="000000" w:themeColor="text1"/>
         </w:rPr>
-        <w:lastRenderedPageBreak/>
         <w:t>writing_stats</w:t>
       </w:r>
       <w:proofErr w:type="spellEnd"/>
@@ -11618,6 +12285,7 @@
             </w14:solidFill>
           </w14:textFill>
         </w:rPr>
+        <w:lastRenderedPageBreak/>
         <w:t>Descriptive Statistics Report</w:t>
       </w:r>
       <w:bookmarkEnd w:id="3"/>
@@ -11939,7 +12607,6 @@
           <w:sz w:val="20"/>
           <w:szCs w:val="20"/>
         </w:rPr>
-        <w:lastRenderedPageBreak/>
         <w:t>• Standard Deviation (14.12):</w:t>
       </w:r>
       <w:r>
@@ -12307,6 +12974,7 @@
           <w:sz w:val="20"/>
           <w:szCs w:val="20"/>
         </w:rPr>
+        <w:lastRenderedPageBreak/>
         <w:t>2. Most Variable Area:</w:t>
       </w:r>
       <w:r>
@@ -12584,7 +13252,6 @@
             </w14:solidFill>
           </w14:textFill>
         </w:rPr>
-        <w:lastRenderedPageBreak/>
         <w:t>4. Conclusion</w:t>
       </w:r>
       <w:bookmarkEnd w:id="10"/>
@@ -12620,6 +13287,9 @@
     <w:p/>
     <w:p/>
     <w:p/>
+    <w:p/>
+    <w:p/>
+    <w:p/>
     <w:p>
       <w:pPr>
         <w:pStyle w:val="Quote"/>
@@ -12631,6 +13301,7 @@
         <w:rPr>
           <w:rFonts w:asciiTheme="minorBidi" w:hAnsiTheme="minorBidi"/>
         </w:rPr>
+        <w:lastRenderedPageBreak/>
         <w:t xml:space="preserve">10- </w:t>
       </w:r>
       <w:r>
@@ -12900,7 +13571,6 @@
                 <w:sz w:val="22"/>
                 <w:szCs w:val="22"/>
               </w:rPr>
-              <w:lastRenderedPageBreak/>
               <w:t xml:space="preserve">Histogram </w:t>
             </w:r>
           </w:p>
@@ -13486,6 +14156,7 @@
                 <w:sz w:val="22"/>
                 <w:szCs w:val="22"/>
               </w:rPr>
+              <w:lastRenderedPageBreak/>
               <w:t xml:space="preserve"> </w:t>
             </w:r>
           </w:p>
@@ -13519,6 +14190,7 @@
               <w:rPr>
                 <w:noProof/>
               </w:rPr>
+              <w:lastRenderedPageBreak/>
               <w:drawing>
                 <wp:inline distT="0" distB="0" distL="0" distR="0" wp14:anchorId="43458F07" wp14:editId="20D34CDE">
                   <wp:extent cx="2762250" cy="2124075"/>
@@ -13828,7 +14500,6 @@
                 <w:sz w:val="22"/>
                 <w:szCs w:val="22"/>
               </w:rPr>
-              <w:lastRenderedPageBreak/>
               <w:t xml:space="preserve">    values='math score</w:t>
             </w:r>
             <w:proofErr w:type="gramStart"/>
@@ -14252,7 +14923,6 @@
               <w:rPr>
                 <w:noProof/>
               </w:rPr>
-              <w:lastRenderedPageBreak/>
               <w:drawing>
                 <wp:inline distT="0" distB="0" distL="0" distR="0" wp14:anchorId="7DA82F62" wp14:editId="71271FFC">
                   <wp:extent cx="3190875" cy="2038350"/>
@@ -14320,6 +14990,7 @@
         <w:rPr>
           <w:rFonts w:asciiTheme="minorBidi" w:hAnsiTheme="minorBidi"/>
         </w:rPr>
+        <w:lastRenderedPageBreak/>
         <w:t xml:space="preserve">11- </w:t>
       </w:r>
       <w:r>
@@ -14578,7 +15249,6 @@
           <w:noProof/>
           <w:lang w:val="en-AE"/>
         </w:rPr>
-        <w:lastRenderedPageBreak/>
         <w:drawing>
           <wp:inline distT="0" distB="0" distL="0" distR="0" wp14:anchorId="1BAC83B2" wp14:editId="11E561E0">
             <wp:extent cx="5734050" cy="2412365"/>
@@ -14834,6 +15504,7 @@
         <w:rPr>
           <w:rFonts w:asciiTheme="minorBidi" w:hAnsiTheme="minorBidi"/>
         </w:rPr>
+        <w:lastRenderedPageBreak/>
         <w:t xml:space="preserve">12- </w:t>
       </w:r>
       <w:r>
@@ -15028,7 +15699,6 @@
           <w:szCs w:val="22"/>
           <w:lang w:val="en-AE"/>
         </w:rPr>
-        <w:lastRenderedPageBreak/>
         <w:t>B. ALTERNATIVE HYPOTHESIS</w:t>
       </w:r>
       <w:r>
@@ -15293,6 +15963,7 @@
       </w:pPr>
       <w:bookmarkStart w:id="11" w:name="_Toc196655596"/>
       <w:r>
+        <w:lastRenderedPageBreak/>
         <w:t xml:space="preserve">CLO 3 - </w:t>
       </w:r>
       <w:r>
@@ -15327,7 +15998,6 @@
         <w:rPr>
           <w:noProof/>
         </w:rPr>
-        <w:lastRenderedPageBreak/>
         <w:drawing>
           <wp:inline distT="0" distB="0" distL="0" distR="0" wp14:anchorId="6256B609" wp14:editId="4BA4388C">
             <wp:extent cx="5734050" cy="2572385"/>
@@ -15459,6 +16129,7 @@
           <w:rFonts w:asciiTheme="minorBidi" w:hAnsiTheme="minorBidi"/>
           <w:lang w:val="en-AE"/>
         </w:rPr>
+        <w:lastRenderedPageBreak/>
         <w:t xml:space="preserve">R² Score (0.68): </w:t>
       </w:r>
       <w:r>
@@ -15473,7 +16144,6 @@
         <w:rPr>
           <w:noProof/>
         </w:rPr>
-        <w:lastRenderedPageBreak/>
         <w:drawing>
           <wp:inline distT="0" distB="0" distL="0" distR="0" wp14:anchorId="081B30C6" wp14:editId="7ABD3376">
             <wp:extent cx="5734050" cy="5471160"/>
@@ -15536,7 +16206,6 @@
         <w:rPr>
           <w:rFonts w:asciiTheme="minorBidi" w:hAnsiTheme="minorBidi"/>
         </w:rPr>
-        <w:lastRenderedPageBreak/>
         <w:t xml:space="preserve">14- </w:t>
       </w:r>
       <w:r>
@@ -17055,6 +17724,7 @@
                 <w:sz w:val="24"/>
                 <w:szCs w:val="24"/>
               </w:rPr>
+              <w:lastRenderedPageBreak/>
               <w:t xml:space="preserve"> </w:t>
             </w:r>
           </w:p>
@@ -17112,7 +17782,6 @@
               <w:rPr>
                 <w:noProof/>
               </w:rPr>
-              <w:lastRenderedPageBreak/>
               <w:drawing>
                 <wp:inline distT="0" distB="0" distL="0" distR="0" wp14:anchorId="7C99317F" wp14:editId="4FDA3CA1">
                   <wp:extent cx="2762250" cy="438150"/>
@@ -17629,7 +18298,7 @@
           <w:lang w:val="en-AE"/>
         </w:rPr>
         <w:drawing>
-          <wp:inline distT="0" distB="0" distL="0" distR="0" wp14:anchorId="6E00C821" wp14:editId="4DBEFB76">
+          <wp:inline distT="0" distB="0" distL="0" distR="0" wp14:anchorId="6E00C821" wp14:editId="6201ECCF">
             <wp:extent cx="3223895" cy="2882900"/>
             <wp:effectExtent l="0" t="0" r="0" b="0"/>
             <wp:docPr id="1729929838" name="Picture 1" descr="A screen shot of a computer program&#10;&#10;AI-generated content may be incorrect."/>
@@ -25734,60 +26403,6 @@
     </w:p>
     <w:p>
       <w:pPr>
-        <w:spacing w:after="160" w:line="276" w:lineRule="auto"/>
-        <w:rPr>
-          <w:rFonts w:ascii="Aptos" w:eastAsia="Aptos" w:hAnsi="Aptos" w:cs="Aptos"/>
-          <w:color w:val="000000" w:themeColor="text1"/>
-        </w:rPr>
-      </w:pPr>
-    </w:p>
-    <w:p>
-      <w:pPr>
-        <w:spacing w:after="160" w:line="276" w:lineRule="auto"/>
-        <w:rPr>
-          <w:rFonts w:ascii="Aptos" w:eastAsia="Aptos" w:hAnsi="Aptos" w:cs="Aptos"/>
-          <w:color w:val="000000" w:themeColor="text1"/>
-        </w:rPr>
-      </w:pPr>
-    </w:p>
-    <w:p>
-      <w:pPr>
-        <w:spacing w:after="160" w:line="276" w:lineRule="auto"/>
-        <w:rPr>
-          <w:rFonts w:ascii="Aptos" w:eastAsia="Aptos" w:hAnsi="Aptos" w:cs="Aptos"/>
-          <w:color w:val="000000" w:themeColor="text1"/>
-        </w:rPr>
-      </w:pPr>
-    </w:p>
-    <w:p>
-      <w:pPr>
-        <w:spacing w:after="160" w:line="276" w:lineRule="auto"/>
-        <w:rPr>
-          <w:rFonts w:ascii="Aptos" w:eastAsia="Aptos" w:hAnsi="Aptos" w:cs="Aptos"/>
-          <w:color w:val="000000" w:themeColor="text1"/>
-        </w:rPr>
-      </w:pPr>
-    </w:p>
-    <w:p>
-      <w:pPr>
-        <w:spacing w:after="160" w:line="276" w:lineRule="auto"/>
-        <w:rPr>
-          <w:rFonts w:ascii="Aptos" w:eastAsia="Aptos" w:hAnsi="Aptos" w:cs="Aptos"/>
-          <w:color w:val="000000" w:themeColor="text1"/>
-        </w:rPr>
-      </w:pPr>
-    </w:p>
-    <w:p>
-      <w:pPr>
-        <w:spacing w:after="160" w:line="276" w:lineRule="auto"/>
-        <w:rPr>
-          <w:rFonts w:ascii="Aptos" w:eastAsia="Aptos" w:hAnsi="Aptos" w:cs="Aptos"/>
-          <w:color w:val="000000" w:themeColor="text1"/>
-        </w:rPr>
-      </w:pPr>
-    </w:p>
-    <w:p>
-      <w:pPr>
         <w:pStyle w:val="Quote"/>
         <w:rPr>
           <w:rFonts w:asciiTheme="minorBidi" w:hAnsiTheme="minorBidi"/>
@@ -25876,6 +26491,7 @@
           <w:bCs/>
           <w:lang w:val="en-AE"/>
         </w:rPr>
+        <w:lastRenderedPageBreak/>
         <w:t>1. Targeted Interventions Based on Clusters</w:t>
       </w:r>
     </w:p>
@@ -26282,7 +26898,6 @@
           <w:rFonts w:asciiTheme="minorBidi" w:hAnsiTheme="minorBidi"/>
           <w:lang w:val="en-AE"/>
         </w:rPr>
-        <w:lastRenderedPageBreak/>
         <w:t xml:space="preserve">Share cluster-based insights with parents to </w:t>
       </w:r>
       <w:r>
@@ -26408,6 +27023,7 @@
           <w:bCs/>
           <w:lang w:val="en-AE"/>
         </w:rPr>
+        <w:lastRenderedPageBreak/>
         <w:t xml:space="preserve">6. Continuous Feedback </w:t>
       </w:r>
     </w:p>
@@ -26478,33 +27094,64 @@
         <w:spacing w:after="0" w:line="240" w:lineRule="auto"/>
         <w:jc w:val="both"/>
         <w:rPr>
-          <w:i/>
-          <w:iCs w:val="0"/>
-          <w:color w:val="808080" w:themeColor="background1" w:themeShade="80"/>
+          <w:rFonts w:asciiTheme="minorBidi" w:hAnsiTheme="minorBidi"/>
         </w:rPr>
       </w:pPr>
     </w:p>
     <w:p>
       <w:pPr>
         <w:pStyle w:val="Heading1"/>
+        <w:rPr>
+          <w:rFonts w:asciiTheme="minorBidi" w:hAnsiTheme="minorBidi"/>
+        </w:rPr>
       </w:pPr>
       <w:bookmarkStart w:id="13" w:name="_Toc196655597"/>
       <w:bookmarkStart w:id="14" w:name="_Hlk137554179"/>
       <w:bookmarkEnd w:id="12"/>
       <w:r>
+        <w:rPr>
+          <w:rFonts w:asciiTheme="minorBidi" w:hAnsiTheme="minorBidi"/>
+          <w:color w:val="auto"/>
+          <w:sz w:val="21"/>
+          <w:szCs w:val="21"/>
+        </w:rPr>
         <w:t xml:space="preserve">CLO </w:t>
       </w:r>
       <w:r>
+        <w:rPr>
+          <w:rFonts w:asciiTheme="minorBidi" w:hAnsiTheme="minorBidi"/>
+          <w:color w:val="auto"/>
+          <w:sz w:val="21"/>
+          <w:szCs w:val="21"/>
+        </w:rPr>
         <w:t>4</w:t>
       </w:r>
       <w:r>
+        <w:rPr>
+          <w:rFonts w:asciiTheme="minorBidi" w:hAnsiTheme="minorBidi"/>
+          <w:color w:val="auto"/>
+          <w:sz w:val="21"/>
+          <w:szCs w:val="21"/>
+        </w:rPr>
         <w:t xml:space="preserve"> - </w:t>
       </w:r>
       <w:r>
+        <w:rPr>
+          <w:rFonts w:asciiTheme="minorBidi" w:hAnsiTheme="minorBidi"/>
+          <w:color w:val="auto"/>
+          <w:sz w:val="21"/>
+          <w:szCs w:val="21"/>
+        </w:rPr>
         <w:t>Version Control</w:t>
       </w:r>
       <w:bookmarkEnd w:id="13"/>
       <w:r>
+        <w:rPr>
+          <w:rFonts w:asciiTheme="minorBidi" w:hAnsiTheme="minorBidi"/>
+          <w:color w:val="auto"/>
+          <w:sz w:val="21"/>
+          <w:szCs w:val="21"/>
+        </w:rPr>
         <w:t xml:space="preserve"> </w:t>
       </w:r>
     </w:p>
@@ -26591,6 +27238,7 @@
         <w:rPr>
           <w:noProof/>
         </w:rPr>
+        <w:lastRenderedPageBreak/>
         <w:drawing>
           <wp:inline distT="0" distB="0" distL="0" distR="0" wp14:anchorId="2E84E10E" wp14:editId="2A01CBB6">
             <wp:extent cx="5734050" cy="2052955"/>
@@ -26757,9 +27405,9 @@
       </w:pPr>
       <w:r>
         <w:rPr>
+          <w:noProof/>
           <w:lang w:bidi="ar-AE"/>
         </w:rPr>
-        <w:lastRenderedPageBreak/>
         <w:drawing>
           <wp:inline distT="0" distB="0" distL="0" distR="0" wp14:anchorId="29B652A9" wp14:editId="0863B161">
             <wp:extent cx="5734050" cy="2190115"/>
@@ -26822,6 +27470,7 @@
         <w:rPr>
           <w:noProof/>
         </w:rPr>
+        <w:lastRenderedPageBreak/>
         <w:drawing>
           <wp:inline distT="0" distB="0" distL="0" distR="0" wp14:anchorId="5CD4AB56" wp14:editId="1F32420F">
             <wp:extent cx="5734050" cy="2779395"/>
@@ -26867,24 +27516,13 @@
       </w:pPr>
     </w:p>
     <w:p>
-      <w:pPr>
-        <w:sectPr>
-          <w:headerReference w:type="default" r:id="rId53"/>
-          <w:footerReference w:type="default" r:id="rId54"/>
-          <w:pgSz w:w="11910" w:h="16840"/>
-          <w:pgMar w:top="2160" w:right="1440" w:bottom="1440" w:left="1440" w:header="720" w:footer="399" w:gutter="0"/>
-          <w:cols w:space="720"/>
-          <w:docGrid w:linePitch="299"/>
-        </w:sectPr>
-      </w:pPr>
       <w:r>
         <w:rPr>
           <w:noProof/>
         </w:rPr>
-        <w:lastRenderedPageBreak/>
         <w:drawing>
-          <wp:inline distT="0" distB="0" distL="0" distR="0" wp14:anchorId="1735A90C" wp14:editId="538A98E4">
-            <wp:extent cx="5734050" cy="2413000"/>
+          <wp:inline distT="0" distB="0" distL="0" distR="0" wp14:anchorId="1735A90C" wp14:editId="611E1266">
+            <wp:extent cx="5734052" cy="2413000"/>
             <wp:effectExtent l="0" t="0" r="0" b="6350"/>
             <wp:docPr id="2075606383" name="Picture 1" descr="A screenshot of a computer&#10;&#10;AI-generated content may be incorrect."/>
             <wp:cNvGraphicFramePr>
@@ -26894,11 +27532,17 @@
               <a:graphicData uri="http://schemas.openxmlformats.org/drawingml/2006/picture">
                 <pic:pic xmlns:pic="http://schemas.openxmlformats.org/drawingml/2006/picture">
                   <pic:nvPicPr>
-                    <pic:cNvPr id="2075606383" name="Picture 1" descr="A screenshot of a computer&#10;&#10;AI-generated content may be incorrect."/>
+                    <pic:cNvPr id="0" name="Picture 1"/>
                     <pic:cNvPicPr/>
                   </pic:nvPicPr>
                   <pic:blipFill>
-                    <a:blip r:embed="rId55"/>
+                    <a:blip r:embed="rId53">
+                      <a:extLst>
+                        <a:ext uri="{28A0092B-C50C-407E-A947-70E740481C1C}">
+                          <a14:useLocalDpi xmlns:a14="http://schemas.microsoft.com/office/drawing/2010/main" val="0"/>
+                        </a:ext>
+                      </a:extLst>
+                    </a:blip>
                     <a:stretch>
                       <a:fillRect/>
                     </a:stretch>
@@ -26906,7 +27550,7 @@
                   <pic:spPr>
                     <a:xfrm>
                       <a:off x="0" y="0"/>
-                      <a:ext cx="5734050" cy="2413000"/>
+                      <a:ext cx="5734052" cy="2413000"/>
                     </a:xfrm>
                     <a:prstGeom prst="rect">
                       <a:avLst/>
@@ -26918,6 +27562,962 @@
           </wp:inline>
         </w:drawing>
       </w:r>
+    </w:p>
+    <w:p/>
+    <w:p>
+      <w:pPr>
+        <w:tabs>
+          <w:tab w:val="right" w:pos="284"/>
+          <w:tab w:val="left" w:pos="7200"/>
+        </w:tabs>
+        <w:spacing w:after="0" w:line="240" w:lineRule="auto"/>
+        <w:jc w:val="both"/>
+        <w:rPr>
+          <w:rFonts w:asciiTheme="minorBidi" w:hAnsiTheme="minorBidi"/>
+        </w:rPr>
+      </w:pPr>
+    </w:p>
+    <w:p>
+      <w:pPr>
+        <w:pStyle w:val="Heading1"/>
+        <w:spacing w:after="160" w:line="276" w:lineRule="auto"/>
+        <w:rPr>
+          <w:rFonts w:asciiTheme="minorBidi" w:hAnsiTheme="minorBidi"/>
+        </w:rPr>
+      </w:pPr>
+      <w:r>
+        <w:rPr>
+          <w:rFonts w:asciiTheme="minorBidi" w:hAnsiTheme="minorBidi"/>
+          <w:color w:val="auto"/>
+          <w:sz w:val="21"/>
+          <w:szCs w:val="21"/>
+        </w:rPr>
+        <w:t xml:space="preserve"> Summary And Conclusion</w:t>
+      </w:r>
+    </w:p>
+    <w:p>
+      <w:pPr>
+        <w:rPr>
+          <w:rFonts w:ascii="Arial Nova" w:eastAsia="Arial Nova" w:hAnsi="Arial Nova" w:cs="Arial Nova"/>
+        </w:rPr>
+      </w:pPr>
+      <w:r>
+        <w:rPr>
+          <w:rFonts w:ascii="Arial Nova" w:eastAsia="Arial Nova" w:hAnsi="Arial Nova" w:cs="Arial Nova"/>
+        </w:rPr>
+        <w:t>For this project, we looked at a dataset about student performance to figure out how things like background and outside factors affect how well students do in school. We did some basic data exploring (EDA), ran some tests, and even built a few machine learning models to try to predict student success.</w:t>
+      </w:r>
+    </w:p>
+    <w:p>
+      <w:pPr>
+        <w:spacing w:after="160"/>
+        <w:rPr>
+          <w:rFonts w:ascii="Arial Nova" w:eastAsia="Arial Nova" w:hAnsi="Arial Nova" w:cs="Arial Nova"/>
+        </w:rPr>
+      </w:pPr>
+      <w:r>
+        <w:rPr>
+          <w:rFonts w:ascii="Arial Nova" w:eastAsia="Arial Nova" w:hAnsi="Arial Nova" w:cs="Arial Nova"/>
+        </w:rPr>
+        <w:t>The main idea was to find out if things like gender, race, parents’ education, lunch programs, and test prep made a difference in students' math, reading, and writing scores. We wanted to see if we could discover patterns that might help teachers and schools support students better.</w:t>
+      </w:r>
+    </w:p>
+    <w:p>
+      <w:pPr>
+        <w:spacing w:after="160"/>
+        <w:rPr>
+          <w:rFonts w:ascii="Arial Nova" w:eastAsia="Arial Nova" w:hAnsi="Arial Nova" w:cs="Arial Nova"/>
+        </w:rPr>
+      </w:pPr>
+      <w:r>
+        <w:rPr>
+          <w:rFonts w:ascii="Arial Nova" w:eastAsia="Arial Nova" w:hAnsi="Arial Nova" w:cs="Arial Nova"/>
+        </w:rPr>
+        <w:lastRenderedPageBreak/>
+        <w:t>We used Python for the whole project. It’s a programming language with tools like Pandas, NumPy, Matplotlib, Seaborn, and scikit-learn</w:t>
+      </w:r>
+      <w:r>
+        <w:rPr>
+          <w:rFonts w:ascii="Arial Nova" w:eastAsia="Arial Nova" w:hAnsi="Arial Nova" w:cs="Arial Nova"/>
+          <w:color w:val="000000" w:themeColor="text1"/>
+        </w:rPr>
+        <w:t xml:space="preserve"> all of which made it easier to handle the data, make graphs, and build machine learning models.</w:t>
+      </w:r>
+    </w:p>
+    <w:p>
+      <w:pPr>
+        <w:spacing w:after="160"/>
+        <w:rPr>
+          <w:rFonts w:ascii="Arial Nova" w:eastAsia="Arial Nova" w:hAnsi="Arial Nova" w:cs="Arial Nova"/>
+          <w:color w:val="000000" w:themeColor="text1"/>
+        </w:rPr>
+      </w:pPr>
+      <w:r>
+        <w:rPr>
+          <w:rFonts w:ascii="Arial Nova" w:eastAsia="Arial Nova" w:hAnsi="Arial Nova" w:cs="Arial Nova"/>
+          <w:color w:val="000000" w:themeColor="text1"/>
+        </w:rPr>
+        <w:t>We used a Logistic Regression model to predict whether students would pass or fail based on their scores. We also used linear regression to see if math and reading scores could predict writing scores.</w:t>
+      </w:r>
+    </w:p>
+    <w:p>
+      <w:pPr>
+        <w:spacing w:after="160"/>
+        <w:rPr>
+          <w:rFonts w:ascii="Arial Nova" w:eastAsia="Arial Nova" w:hAnsi="Arial Nova" w:cs="Arial Nova"/>
+          <w:color w:val="000000" w:themeColor="text1"/>
+        </w:rPr>
+      </w:pPr>
+      <w:r>
+        <w:rPr>
+          <w:rFonts w:ascii="Arial Nova" w:eastAsia="Arial Nova" w:hAnsi="Arial Nova" w:cs="Arial Nova"/>
+          <w:color w:val="000000" w:themeColor="text1"/>
+        </w:rPr>
+        <w:t>We used both random and systematic sampling to pick students from the dataset. Then, we looked at basic statistics like the average scores, the most common scores, how spread out the scores were, and whether they leaned higher or lower.</w:t>
+      </w:r>
+    </w:p>
+    <w:p>
+      <w:pPr>
+        <w:pStyle w:val="ListParagraph"/>
+        <w:spacing w:after="0"/>
+        <w:ind w:left="1080"/>
+        <w:rPr>
+          <w:rFonts w:ascii="Arial Nova" w:eastAsia="Arial Nova" w:hAnsi="Arial Nova" w:cs="Arial Nova"/>
+          <w:color w:val="000000" w:themeColor="text1"/>
+          <w:sz w:val="20"/>
+          <w:szCs w:val="20"/>
+        </w:rPr>
+      </w:pPr>
+      <w:r>
+        <w:rPr>
+          <w:rFonts w:ascii="Arial Nova" w:eastAsia="Arial Nova" w:hAnsi="Arial Nova" w:cs="Arial Nova"/>
+          <w:color w:val="000000" w:themeColor="text1"/>
+          <w:sz w:val="20"/>
+          <w:szCs w:val="20"/>
+        </w:rPr>
+        <w:t>We used a chi-square test to check if gender and test prep were connected. It turned out they weren’t really linked.</w:t>
+      </w:r>
+    </w:p>
+    <w:p>
+      <w:pPr>
+        <w:pStyle w:val="ListParagraph"/>
+        <w:spacing w:after="0"/>
+        <w:ind w:left="1080"/>
+        <w:rPr>
+          <w:rFonts w:ascii="Arial Nova" w:eastAsia="Arial Nova" w:hAnsi="Arial Nova" w:cs="Arial Nova"/>
+          <w:color w:val="000000" w:themeColor="text1"/>
+          <w:sz w:val="20"/>
+          <w:szCs w:val="20"/>
+        </w:rPr>
+      </w:pPr>
+      <w:r>
+        <w:rPr>
+          <w:rFonts w:ascii="Arial Nova" w:eastAsia="Arial Nova" w:hAnsi="Arial Nova" w:cs="Arial Nova"/>
+          <w:color w:val="000000" w:themeColor="text1"/>
+          <w:sz w:val="20"/>
+          <w:szCs w:val="20"/>
+        </w:rPr>
+        <w:t>We also did a one-sample t-test to see if the average writing score for girls was different from the overall average, but it wasn’t.</w:t>
+      </w:r>
+    </w:p>
+    <w:p>
+      <w:pPr>
+        <w:pStyle w:val="ListParagraph"/>
+        <w:numPr>
+          <w:ilvl w:val="0"/>
+          <w:numId w:val="0"/>
+        </w:numPr>
+        <w:spacing w:after="0"/>
+        <w:ind w:left="1080" w:hanging="360"/>
+        <w:rPr>
+          <w:rFonts w:ascii="Arial Nova" w:eastAsia="Arial Nova" w:hAnsi="Arial Nova" w:cs="Arial Nova"/>
+          <w:color w:val="000000" w:themeColor="text1"/>
+          <w:sz w:val="20"/>
+          <w:szCs w:val="20"/>
+        </w:rPr>
+      </w:pPr>
+    </w:p>
+    <w:p>
+      <w:pPr>
+        <w:spacing w:after="160"/>
+        <w:rPr>
+          <w:rFonts w:ascii="Arial Nova" w:eastAsia="Arial Nova" w:hAnsi="Arial Nova" w:cs="Arial Nova"/>
+          <w:color w:val="000000" w:themeColor="text1"/>
+        </w:rPr>
+      </w:pPr>
+      <w:r>
+        <w:rPr>
+          <w:rFonts w:ascii="Arial Nova" w:eastAsia="Arial Nova" w:hAnsi="Arial Nova" w:cs="Arial Nova"/>
+          <w:color w:val="000000" w:themeColor="text1"/>
+        </w:rPr>
+        <w:t>We tested four models: Logistic Regression, KNN, Naïve Bayes, and Decision Tree. We used confusion matrices and checked things like accuracy, precision, recall, and F1-scores. Logistic Regression did the best overall.</w:t>
+      </w:r>
+    </w:p>
+    <w:p>
+      <w:pPr>
+        <w:spacing w:after="160"/>
+        <w:rPr>
+          <w:rFonts w:ascii="Arial Nova" w:eastAsia="Arial Nova" w:hAnsi="Arial Nova" w:cs="Arial Nova"/>
+          <w:color w:val="000000" w:themeColor="text1"/>
+        </w:rPr>
+      </w:pPr>
+      <w:r>
+        <w:rPr>
+          <w:rFonts w:ascii="Arial Nova" w:eastAsia="Arial Nova" w:hAnsi="Arial Nova" w:cs="Arial Nova"/>
+          <w:color w:val="000000" w:themeColor="text1"/>
+        </w:rPr>
+        <w:t>We also tried grouping students into clusters using K-means and hierarchical clustering. That way, we could suggest different strategies for different types of students based on how they were doing.</w:t>
+      </w:r>
+    </w:p>
+    <w:p>
+      <w:pPr>
+        <w:spacing w:after="160"/>
+        <w:rPr>
+          <w:rFonts w:ascii="Arial Nova" w:eastAsia="Arial Nova" w:hAnsi="Arial Nova" w:cs="Arial Nova"/>
+          <w:color w:val="000000" w:themeColor="text1"/>
+        </w:rPr>
+      </w:pPr>
+      <w:r>
+        <w:rPr>
+          <w:rFonts w:ascii="Arial Nova" w:eastAsia="Arial Nova" w:hAnsi="Arial Nova" w:cs="Arial Nova"/>
+          <w:color w:val="000000" w:themeColor="text1"/>
+        </w:rPr>
+        <w:t>We worked together as a team on this project. After all the exploring, testing, modeling, and clustering, we found some interesting insights about how outside factors can affect student success. Our prediction model worked well, and clustering gave us good ideas on how schools might better help different groups of students. Overall, it showed that using data can really help schools make smarter choices to support students.</w:t>
+      </w:r>
+    </w:p>
+    <w:p>
+      <w:pPr>
+        <w:spacing w:after="160"/>
+        <w:rPr>
+          <w:rFonts w:ascii="Arial Nova" w:eastAsia="Arial Nova" w:hAnsi="Arial Nova" w:cs="Arial Nova"/>
+          <w:color w:val="000000" w:themeColor="text1"/>
+        </w:rPr>
+      </w:pPr>
+    </w:p>
+    <w:p>
+      <w:pPr>
+        <w:spacing w:after="160" w:line="276" w:lineRule="auto"/>
+      </w:pPr>
+      <w:r>
+        <w:rPr>
+          <w:rFonts w:ascii="Aptos" w:eastAsia="Aptos" w:hAnsi="Aptos" w:cs="Aptos"/>
+          <w:color w:val="000000" w:themeColor="text1"/>
+        </w:rPr>
+        <w:t xml:space="preserve"> </w:t>
+      </w:r>
+    </w:p>
+    <w:tbl>
+      <w:tblPr>
+        <w:tblStyle w:val="TableGrid"/>
+        <w:tblW w:w="0" w:type="auto"/>
+        <w:tblLayout w:type="fixed"/>
+        <w:tblLook w:val="06A0" w:firstRow="1" w:lastRow="0" w:firstColumn="1" w:lastColumn="0" w:noHBand="1" w:noVBand="1"/>
+      </w:tblPr>
+      <w:tblGrid>
+        <w:gridCol w:w="4515"/>
+        <w:gridCol w:w="4515"/>
+      </w:tblGrid>
+      <w:tr>
+        <w:trPr>
+          <w:trHeight w:val="300"/>
+        </w:trPr>
+        <w:tc>
+          <w:tcPr>
+            <w:tcW w:w="4515" w:type="dxa"/>
+            <w:tcBorders>
+              <w:top w:val="single" w:sz="8" w:space="0" w:color="auto"/>
+              <w:left w:val="single" w:sz="8" w:space="0" w:color="auto"/>
+              <w:bottom w:val="single" w:sz="8" w:space="0" w:color="auto"/>
+              <w:right w:val="single" w:sz="8" w:space="0" w:color="auto"/>
+            </w:tcBorders>
+            <w:tcMar>
+              <w:left w:w="108" w:type="dxa"/>
+              <w:right w:w="108" w:type="dxa"/>
+            </w:tcMar>
+          </w:tcPr>
+          <w:p>
+            <w:r>
+              <w:rPr>
+                <w:rFonts w:ascii="Aptos" w:eastAsia="Aptos" w:hAnsi="Aptos" w:cs="Aptos"/>
+                <w:color w:val="000000" w:themeColor="text1"/>
+                <w:sz w:val="24"/>
+                <w:szCs w:val="24"/>
+              </w:rPr>
+              <w:t xml:space="preserve">Names </w:t>
+            </w:r>
+          </w:p>
+        </w:tc>
+        <w:tc>
+          <w:tcPr>
+            <w:tcW w:w="4515" w:type="dxa"/>
+            <w:tcBorders>
+              <w:top w:val="single" w:sz="8" w:space="0" w:color="auto"/>
+              <w:left w:val="single" w:sz="8" w:space="0" w:color="auto"/>
+              <w:bottom w:val="single" w:sz="8" w:space="0" w:color="auto"/>
+              <w:right w:val="single" w:sz="8" w:space="0" w:color="auto"/>
+            </w:tcBorders>
+            <w:tcMar>
+              <w:left w:w="108" w:type="dxa"/>
+              <w:right w:w="108" w:type="dxa"/>
+            </w:tcMar>
+          </w:tcPr>
+          <w:p>
+            <w:r>
+              <w:rPr>
+                <w:rFonts w:ascii="Aptos" w:eastAsia="Aptos" w:hAnsi="Aptos" w:cs="Aptos"/>
+                <w:color w:val="000000" w:themeColor="text1"/>
+                <w:sz w:val="24"/>
+                <w:szCs w:val="24"/>
+              </w:rPr>
+              <w:t xml:space="preserve">Tasks done </w:t>
+            </w:r>
+          </w:p>
+        </w:tc>
+      </w:tr>
+      <w:tr>
+        <w:trPr>
+          <w:trHeight w:val="300"/>
+        </w:trPr>
+        <w:tc>
+          <w:tcPr>
+            <w:tcW w:w="4515" w:type="dxa"/>
+            <w:tcBorders>
+              <w:top w:val="single" w:sz="8" w:space="0" w:color="auto"/>
+              <w:left w:val="single" w:sz="8" w:space="0" w:color="auto"/>
+              <w:bottom w:val="single" w:sz="8" w:space="0" w:color="auto"/>
+              <w:right w:val="single" w:sz="8" w:space="0" w:color="auto"/>
+            </w:tcBorders>
+            <w:tcMar>
+              <w:left w:w="108" w:type="dxa"/>
+              <w:right w:w="108" w:type="dxa"/>
+            </w:tcMar>
+          </w:tcPr>
+          <w:p>
+            <w:r>
+              <w:rPr>
+                <w:rFonts w:ascii="Aptos" w:eastAsia="Aptos" w:hAnsi="Aptos" w:cs="Aptos"/>
+                <w:color w:val="000000" w:themeColor="text1"/>
+                <w:sz w:val="24"/>
+                <w:szCs w:val="24"/>
+              </w:rPr>
+              <w:t>Maryam Ali</w:t>
+            </w:r>
+          </w:p>
+        </w:tc>
+        <w:tc>
+          <w:tcPr>
+            <w:tcW w:w="4515" w:type="dxa"/>
+            <w:tcBorders>
+              <w:top w:val="single" w:sz="8" w:space="0" w:color="auto"/>
+              <w:left w:val="single" w:sz="8" w:space="0" w:color="auto"/>
+              <w:bottom w:val="single" w:sz="8" w:space="0" w:color="auto"/>
+              <w:right w:val="single" w:sz="8" w:space="0" w:color="auto"/>
+            </w:tcBorders>
+            <w:tcMar>
+              <w:left w:w="108" w:type="dxa"/>
+              <w:right w:w="108" w:type="dxa"/>
+            </w:tcMar>
+          </w:tcPr>
+          <w:p>
+            <w:r>
+              <w:rPr>
+                <w:rFonts w:ascii="Aptos" w:eastAsia="Aptos" w:hAnsi="Aptos" w:cs="Aptos"/>
+                <w:color w:val="000000" w:themeColor="text1"/>
+                <w:sz w:val="24"/>
+                <w:szCs w:val="24"/>
+              </w:rPr>
+              <w:t>1- Define the purpose of data analysis for the chosen dataset</w:t>
+            </w:r>
+          </w:p>
+          <w:p>
+            <w:r>
+              <w:rPr>
+                <w:rFonts w:ascii="Aptos" w:eastAsia="Aptos" w:hAnsi="Aptos" w:cs="Aptos"/>
+                <w:color w:val="000000" w:themeColor="text1"/>
+                <w:sz w:val="24"/>
+                <w:szCs w:val="24"/>
+              </w:rPr>
+              <w:t>2- Identify and justify the type of programming used for data analysis</w:t>
+            </w:r>
+          </w:p>
+          <w:p>
+            <w:r>
+              <w:rPr>
+                <w:rFonts w:ascii="Aptos" w:eastAsia="Aptos" w:hAnsi="Aptos" w:cs="Aptos"/>
+                <w:color w:val="000000" w:themeColor="text1"/>
+                <w:sz w:val="24"/>
+                <w:szCs w:val="24"/>
+              </w:rPr>
+              <w:t>3- Identify the type and purpose of the machine learning algorithm to be implemented for the chosen dataset</w:t>
+            </w:r>
+          </w:p>
+          <w:p>
+            <w:r>
+              <w:rPr>
+                <w:rFonts w:ascii="Aptos" w:eastAsia="Aptos" w:hAnsi="Aptos" w:cs="Aptos"/>
+                <w:color w:val="000000" w:themeColor="text1"/>
+                <w:sz w:val="24"/>
+                <w:szCs w:val="24"/>
+              </w:rPr>
+              <w:lastRenderedPageBreak/>
+              <w:t>4- Identify and justify the independent and dependent variables for the chosen dataset.</w:t>
+            </w:r>
+          </w:p>
+          <w:p>
+            <w:r>
+              <w:rPr>
+                <w:rFonts w:ascii="Aptos" w:eastAsia="Aptos" w:hAnsi="Aptos" w:cs="Aptos"/>
+                <w:color w:val="000000" w:themeColor="text1"/>
+                <w:sz w:val="24"/>
+                <w:szCs w:val="24"/>
+              </w:rPr>
+              <w:t xml:space="preserve">5- Justify why you want to perform the descriptive analysis for the chosen dataset. </w:t>
+            </w:r>
+          </w:p>
+          <w:p>
+            <w:r>
+              <w:rPr>
+                <w:rFonts w:ascii="Aptos" w:eastAsia="Aptos" w:hAnsi="Aptos" w:cs="Aptos"/>
+                <w:color w:val="000000" w:themeColor="text1"/>
+                <w:sz w:val="24"/>
+                <w:szCs w:val="24"/>
+              </w:rPr>
+              <w:t>11- Perform the hypothesis test to find the correlation (Pearson and Spearman for numerical variable and chi-square test for categorical variable) between the independent variable and the dependent variable.</w:t>
+            </w:r>
+          </w:p>
+          <w:p>
+            <w:r>
+              <w:rPr>
+                <w:rFonts w:ascii="Aptos" w:eastAsia="Aptos" w:hAnsi="Aptos" w:cs="Aptos"/>
+                <w:color w:val="000000" w:themeColor="text1"/>
+                <w:sz w:val="24"/>
+                <w:szCs w:val="24"/>
+              </w:rPr>
+              <w:t>12- Assess the performance of the dependent variable to know whether the sample is representative of the normal population by a one-sample t-test.</w:t>
+            </w:r>
+          </w:p>
+          <w:p>
+            <w:r>
+              <w:rPr>
+                <w:rFonts w:ascii="Aptos" w:eastAsia="Aptos" w:hAnsi="Aptos" w:cs="Aptos"/>
+                <w:color w:val="000000" w:themeColor="text1"/>
+                <w:sz w:val="24"/>
+                <w:szCs w:val="24"/>
+              </w:rPr>
+              <w:t>15- Predict the value of the dependent variable from the different classifier such as Logistic Regression, KNN, Naïve-Bayes and Decision Tree.</w:t>
+            </w:r>
+          </w:p>
+          <w:p>
+            <w:r>
+              <w:rPr>
+                <w:rFonts w:ascii="Aptos" w:eastAsia="Aptos" w:hAnsi="Aptos" w:cs="Aptos"/>
+                <w:color w:val="000000" w:themeColor="text1"/>
+                <w:sz w:val="24"/>
+                <w:szCs w:val="24"/>
+              </w:rPr>
+              <w:t>19- Explain the strategy for improving the system after viewing the cluster diagram.</w:t>
+            </w:r>
+          </w:p>
+        </w:tc>
+      </w:tr>
+      <w:tr>
+        <w:trPr>
+          <w:trHeight w:val="300"/>
+        </w:trPr>
+        <w:tc>
+          <w:tcPr>
+            <w:tcW w:w="4515" w:type="dxa"/>
+            <w:tcBorders>
+              <w:top w:val="single" w:sz="8" w:space="0" w:color="auto"/>
+              <w:left w:val="single" w:sz="8" w:space="0" w:color="auto"/>
+              <w:bottom w:val="single" w:sz="8" w:space="0" w:color="auto"/>
+              <w:right w:val="single" w:sz="8" w:space="0" w:color="auto"/>
+            </w:tcBorders>
+            <w:tcMar>
+              <w:left w:w="108" w:type="dxa"/>
+              <w:right w:w="108" w:type="dxa"/>
+            </w:tcMar>
+          </w:tcPr>
+          <w:p>
+            <w:r>
+              <w:rPr>
+                <w:rFonts w:ascii="Aptos" w:eastAsia="Aptos" w:hAnsi="Aptos" w:cs="Aptos"/>
+                <w:color w:val="000000" w:themeColor="text1"/>
+                <w:sz w:val="24"/>
+                <w:szCs w:val="24"/>
+              </w:rPr>
+              <w:lastRenderedPageBreak/>
+              <w:t>Nourah Abduallah</w:t>
+            </w:r>
+          </w:p>
+        </w:tc>
+        <w:tc>
+          <w:tcPr>
+            <w:tcW w:w="4515" w:type="dxa"/>
+            <w:tcBorders>
+              <w:top w:val="single" w:sz="8" w:space="0" w:color="auto"/>
+              <w:left w:val="single" w:sz="8" w:space="0" w:color="auto"/>
+              <w:bottom w:val="single" w:sz="8" w:space="0" w:color="auto"/>
+              <w:right w:val="single" w:sz="8" w:space="0" w:color="auto"/>
+            </w:tcBorders>
+            <w:tcMar>
+              <w:left w:w="108" w:type="dxa"/>
+              <w:right w:w="108" w:type="dxa"/>
+            </w:tcMar>
+          </w:tcPr>
+          <w:p>
+            <w:r>
+              <w:rPr>
+                <w:rFonts w:ascii="Aptos" w:eastAsia="Aptos" w:hAnsi="Aptos" w:cs="Aptos"/>
+                <w:color w:val="000000" w:themeColor="text1"/>
+                <w:sz w:val="24"/>
+                <w:szCs w:val="24"/>
+              </w:rPr>
+              <w:t>8- Create a script for systematic sampling by giving certain conditions and finding the desc stat for the dependent variable from the sample [Apply the descriptive function which you created].</w:t>
+            </w:r>
+          </w:p>
+          <w:p>
+            <w:r>
+              <w:rPr>
+                <w:rFonts w:ascii="Aptos" w:eastAsia="Aptos" w:hAnsi="Aptos" w:cs="Aptos"/>
+                <w:color w:val="000000" w:themeColor="text1"/>
+                <w:sz w:val="24"/>
+                <w:szCs w:val="24"/>
+              </w:rPr>
+              <w:t xml:space="preserve"> </w:t>
+            </w:r>
+          </w:p>
+          <w:p>
+            <w:r>
+              <w:rPr>
+                <w:rFonts w:ascii="Aptos" w:eastAsia="Aptos" w:hAnsi="Aptos" w:cs="Aptos"/>
+                <w:color w:val="000000" w:themeColor="text1"/>
+                <w:sz w:val="24"/>
+                <w:szCs w:val="24"/>
+              </w:rPr>
+              <w:t>9- Create a detailed descriptive statistics report about the dependent variable of the chosen dataset.</w:t>
+            </w:r>
+          </w:p>
+          <w:p>
+            <w:r>
+              <w:rPr>
+                <w:rFonts w:ascii="Aptos" w:eastAsia="Aptos" w:hAnsi="Aptos" w:cs="Aptos"/>
+                <w:color w:val="000000" w:themeColor="text1"/>
+                <w:sz w:val="24"/>
+                <w:szCs w:val="24"/>
+              </w:rPr>
+              <w:t xml:space="preserve"> </w:t>
+            </w:r>
+          </w:p>
+          <w:p>
+            <w:r>
+              <w:rPr>
+                <w:rFonts w:ascii="Aptos" w:eastAsia="Aptos" w:hAnsi="Aptos" w:cs="Aptos"/>
+                <w:color w:val="000000" w:themeColor="text1"/>
+                <w:sz w:val="24"/>
+                <w:szCs w:val="24"/>
+              </w:rPr>
+              <w:t>13- Build, Train, Develop and Evaluate using Simple Regression for chosen dataset.</w:t>
+            </w:r>
+          </w:p>
+          <w:p>
+            <w:r>
+              <w:rPr>
+                <w:rFonts w:ascii="Aptos" w:eastAsia="Aptos" w:hAnsi="Aptos" w:cs="Aptos"/>
+                <w:color w:val="000000" w:themeColor="text1"/>
+                <w:sz w:val="24"/>
+                <w:szCs w:val="24"/>
+              </w:rPr>
+              <w:t xml:space="preserve"> </w:t>
+            </w:r>
+          </w:p>
+          <w:p>
+            <w:r>
+              <w:rPr>
+                <w:rFonts w:ascii="Aptos" w:eastAsia="Aptos" w:hAnsi="Aptos" w:cs="Aptos"/>
+                <w:color w:val="000000" w:themeColor="text1"/>
+                <w:sz w:val="24"/>
+                <w:szCs w:val="24"/>
+              </w:rPr>
+              <w:lastRenderedPageBreak/>
+              <w:t>17- Predict the dependent variable by using best-fit classifier.</w:t>
+            </w:r>
+          </w:p>
+        </w:tc>
+      </w:tr>
+      <w:tr>
+        <w:trPr>
+          <w:trHeight w:val="300"/>
+        </w:trPr>
+        <w:tc>
+          <w:tcPr>
+            <w:tcW w:w="4515" w:type="dxa"/>
+            <w:tcBorders>
+              <w:top w:val="single" w:sz="8" w:space="0" w:color="auto"/>
+              <w:left w:val="single" w:sz="8" w:space="0" w:color="auto"/>
+              <w:bottom w:val="single" w:sz="8" w:space="0" w:color="auto"/>
+              <w:right w:val="single" w:sz="8" w:space="0" w:color="auto"/>
+            </w:tcBorders>
+            <w:tcMar>
+              <w:left w:w="108" w:type="dxa"/>
+              <w:right w:w="108" w:type="dxa"/>
+            </w:tcMar>
+          </w:tcPr>
+          <w:p>
+            <w:r>
+              <w:rPr>
+                <w:rFonts w:ascii="Aptos" w:eastAsia="Aptos" w:hAnsi="Aptos" w:cs="Aptos"/>
+                <w:color w:val="000000" w:themeColor="text1"/>
+                <w:sz w:val="24"/>
+                <w:szCs w:val="24"/>
+              </w:rPr>
+              <w:lastRenderedPageBreak/>
+              <w:t xml:space="preserve">Hessa </w:t>
+            </w:r>
+            <w:proofErr w:type="spellStart"/>
+            <w:r>
+              <w:rPr>
+                <w:rFonts w:ascii="Aptos" w:eastAsia="Aptos" w:hAnsi="Aptos" w:cs="Aptos"/>
+                <w:color w:val="000000" w:themeColor="text1"/>
+                <w:sz w:val="24"/>
+                <w:szCs w:val="24"/>
+              </w:rPr>
+              <w:t>khalfan</w:t>
+            </w:r>
+            <w:proofErr w:type="spellEnd"/>
+          </w:p>
+        </w:tc>
+        <w:tc>
+          <w:tcPr>
+            <w:tcW w:w="4515" w:type="dxa"/>
+            <w:tcBorders>
+              <w:top w:val="single" w:sz="8" w:space="0" w:color="auto"/>
+              <w:left w:val="single" w:sz="8" w:space="0" w:color="auto"/>
+              <w:bottom w:val="single" w:sz="8" w:space="0" w:color="auto"/>
+              <w:right w:val="single" w:sz="8" w:space="0" w:color="auto"/>
+            </w:tcBorders>
+            <w:tcMar>
+              <w:left w:w="108" w:type="dxa"/>
+              <w:right w:w="108" w:type="dxa"/>
+            </w:tcMar>
+          </w:tcPr>
+          <w:p>
+            <w:r>
+              <w:rPr>
+                <w:rFonts w:ascii="Aptos" w:eastAsia="Aptos" w:hAnsi="Aptos" w:cs="Aptos"/>
+                <w:color w:val="000000" w:themeColor="text1"/>
+                <w:sz w:val="24"/>
+                <w:szCs w:val="24"/>
+              </w:rPr>
+              <w:t>6. Create a script to develop a Python function for descriptive statistics. The input for the function should be the sample and the field to perform the descriptive statistics.</w:t>
+            </w:r>
+          </w:p>
+          <w:p>
+            <w:r>
+              <w:rPr>
+                <w:rFonts w:ascii="Aptos" w:eastAsia="Aptos" w:hAnsi="Aptos" w:cs="Aptos"/>
+                <w:color w:val="000000" w:themeColor="text1"/>
+                <w:sz w:val="24"/>
+                <w:szCs w:val="24"/>
+              </w:rPr>
+              <w:t xml:space="preserve">7.             Create </w:t>
+            </w:r>
+            <w:proofErr w:type="gramStart"/>
+            <w:r>
+              <w:rPr>
+                <w:rFonts w:ascii="Aptos" w:eastAsia="Aptos" w:hAnsi="Aptos" w:cs="Aptos"/>
+                <w:color w:val="000000" w:themeColor="text1"/>
+                <w:sz w:val="24"/>
+                <w:szCs w:val="24"/>
+              </w:rPr>
+              <w:t>a program to</w:t>
+            </w:r>
+            <w:proofErr w:type="gramEnd"/>
+            <w:r>
+              <w:rPr>
+                <w:rFonts w:ascii="Aptos" w:eastAsia="Aptos" w:hAnsi="Aptos" w:cs="Aptos"/>
+                <w:color w:val="000000" w:themeColor="text1"/>
+                <w:sz w:val="24"/>
+                <w:szCs w:val="24"/>
+              </w:rPr>
+              <w:t xml:space="preserve"> random sampling of size 150 and find the descriptive statistics for the dependent variable from the sample [Apply the descriptive function which you created].</w:t>
+            </w:r>
+          </w:p>
+          <w:p>
+            <w:r>
+              <w:rPr>
+                <w:rFonts w:ascii="Aptos" w:eastAsia="Aptos" w:hAnsi="Aptos" w:cs="Aptos"/>
+                <w:color w:val="000000" w:themeColor="text1"/>
+                <w:sz w:val="24"/>
+                <w:szCs w:val="24"/>
+              </w:rPr>
+              <w:t>16.          Evaluate the performance of each model using confusion matrix and accuracy and identify the best fit classifier for the chosen dataset.</w:t>
+            </w:r>
+          </w:p>
+          <w:p>
+            <w:r>
+              <w:rPr>
+                <w:rFonts w:ascii="Aptos" w:eastAsia="Aptos" w:hAnsi="Aptos" w:cs="Aptos"/>
+                <w:color w:val="000000" w:themeColor="text1"/>
+                <w:sz w:val="24"/>
+                <w:szCs w:val="24"/>
+              </w:rPr>
+              <w:t xml:space="preserve">20.          Create a new repo for </w:t>
+            </w:r>
+            <w:proofErr w:type="gramStart"/>
+            <w:r>
+              <w:rPr>
+                <w:rFonts w:ascii="Aptos" w:eastAsia="Aptos" w:hAnsi="Aptos" w:cs="Aptos"/>
+                <w:color w:val="000000" w:themeColor="text1"/>
+                <w:sz w:val="24"/>
+                <w:szCs w:val="24"/>
+              </w:rPr>
+              <w:t>project</w:t>
+            </w:r>
+            <w:proofErr w:type="gramEnd"/>
+            <w:r>
+              <w:rPr>
+                <w:rFonts w:ascii="Aptos" w:eastAsia="Aptos" w:hAnsi="Aptos" w:cs="Aptos"/>
+                <w:color w:val="000000" w:themeColor="text1"/>
+                <w:sz w:val="24"/>
+                <w:szCs w:val="24"/>
+              </w:rPr>
+              <w:t xml:space="preserve"> in Git Hub</w:t>
+            </w:r>
+          </w:p>
+          <w:p>
+            <w:r>
+              <w:rPr>
+                <w:rFonts w:ascii="Aptos" w:eastAsia="Aptos" w:hAnsi="Aptos" w:cs="Aptos"/>
+                <w:color w:val="000000" w:themeColor="text1"/>
+                <w:sz w:val="24"/>
+                <w:szCs w:val="24"/>
+              </w:rPr>
+              <w:t>21.          Upload all the project files created for CLO</w:t>
+            </w:r>
+            <w:proofErr w:type="gramStart"/>
+            <w:r>
+              <w:rPr>
+                <w:rFonts w:ascii="Aptos" w:eastAsia="Aptos" w:hAnsi="Aptos" w:cs="Aptos"/>
+                <w:color w:val="000000" w:themeColor="text1"/>
+                <w:sz w:val="24"/>
+                <w:szCs w:val="24"/>
+              </w:rPr>
+              <w:t>1,CLO</w:t>
+            </w:r>
+            <w:proofErr w:type="gramEnd"/>
+            <w:r>
+              <w:rPr>
+                <w:rFonts w:ascii="Aptos" w:eastAsia="Aptos" w:hAnsi="Aptos" w:cs="Aptos"/>
+                <w:color w:val="000000" w:themeColor="text1"/>
+                <w:sz w:val="24"/>
+                <w:szCs w:val="24"/>
+              </w:rPr>
+              <w:t>2 and CLO3 to the Git Hub repo</w:t>
+            </w:r>
+          </w:p>
+          <w:p>
+            <w:r>
+              <w:rPr>
+                <w:rFonts w:ascii="Aptos" w:eastAsia="Aptos" w:hAnsi="Aptos" w:cs="Aptos"/>
+                <w:color w:val="000000" w:themeColor="text1"/>
+                <w:sz w:val="24"/>
+                <w:szCs w:val="24"/>
+              </w:rPr>
+              <w:t>22.          Configure Git with GitHub</w:t>
+            </w:r>
+          </w:p>
+          <w:p>
+            <w:r>
+              <w:rPr>
+                <w:rFonts w:ascii="Aptos" w:eastAsia="Aptos" w:hAnsi="Aptos" w:cs="Aptos"/>
+                <w:color w:val="000000" w:themeColor="text1"/>
+                <w:sz w:val="24"/>
+                <w:szCs w:val="24"/>
+              </w:rPr>
+              <w:t>23.          Clone Git hub repo to Git</w:t>
+            </w:r>
+          </w:p>
+          <w:p>
+            <w:r>
+              <w:rPr>
+                <w:rFonts w:ascii="Aptos" w:eastAsia="Aptos" w:hAnsi="Aptos" w:cs="Aptos"/>
+                <w:color w:val="000000" w:themeColor="text1"/>
+                <w:sz w:val="24"/>
+                <w:szCs w:val="24"/>
+              </w:rPr>
+              <w:t>24.          Pull any file from Git Hub repo to Git</w:t>
+            </w:r>
+          </w:p>
+          <w:p>
+            <w:r>
+              <w:rPr>
+                <w:rFonts w:ascii="Aptos" w:eastAsia="Aptos" w:hAnsi="Aptos" w:cs="Aptos"/>
+                <w:color w:val="000000" w:themeColor="text1"/>
+                <w:sz w:val="24"/>
+                <w:szCs w:val="24"/>
+              </w:rPr>
+              <w:t>25.          Modify the pulled file and push the modified file to Git Hub</w:t>
+            </w:r>
+          </w:p>
+        </w:tc>
+      </w:tr>
+      <w:tr>
+        <w:trPr>
+          <w:trHeight w:val="300"/>
+        </w:trPr>
+        <w:tc>
+          <w:tcPr>
+            <w:tcW w:w="4515" w:type="dxa"/>
+            <w:tcBorders>
+              <w:top w:val="single" w:sz="8" w:space="0" w:color="auto"/>
+              <w:left w:val="single" w:sz="8" w:space="0" w:color="auto"/>
+              <w:bottom w:val="single" w:sz="8" w:space="0" w:color="auto"/>
+              <w:right w:val="single" w:sz="8" w:space="0" w:color="auto"/>
+            </w:tcBorders>
+            <w:tcMar>
+              <w:left w:w="108" w:type="dxa"/>
+              <w:right w:w="108" w:type="dxa"/>
+            </w:tcMar>
+          </w:tcPr>
+          <w:p>
+            <w:r>
+              <w:rPr>
+                <w:rFonts w:ascii="Aptos" w:eastAsia="Aptos" w:hAnsi="Aptos" w:cs="Aptos"/>
+                <w:color w:val="000000" w:themeColor="text1"/>
+                <w:sz w:val="24"/>
+                <w:szCs w:val="24"/>
+              </w:rPr>
+              <w:t>Meera Mohamed</w:t>
+            </w:r>
+          </w:p>
+        </w:tc>
+        <w:tc>
+          <w:tcPr>
+            <w:tcW w:w="4515" w:type="dxa"/>
+            <w:tcBorders>
+              <w:top w:val="single" w:sz="8" w:space="0" w:color="auto"/>
+              <w:left w:val="single" w:sz="8" w:space="0" w:color="auto"/>
+              <w:bottom w:val="single" w:sz="8" w:space="0" w:color="auto"/>
+              <w:right w:val="single" w:sz="8" w:space="0" w:color="auto"/>
+            </w:tcBorders>
+            <w:tcMar>
+              <w:left w:w="108" w:type="dxa"/>
+              <w:right w:w="108" w:type="dxa"/>
+            </w:tcMar>
+          </w:tcPr>
+          <w:p>
+            <w:pPr>
+              <w:pStyle w:val="ListParagraph"/>
+              <w:ind w:left="720"/>
+              <w:rPr>
+                <w:rFonts w:ascii="Aptos" w:eastAsia="Aptos" w:hAnsi="Aptos" w:cs="Aptos"/>
+                <w:color w:val="000000" w:themeColor="text1"/>
+                <w:sz w:val="24"/>
+                <w:szCs w:val="24"/>
+              </w:rPr>
+            </w:pPr>
+            <w:r>
+              <w:rPr>
+                <w:rFonts w:ascii="Aptos" w:eastAsia="Aptos" w:hAnsi="Aptos" w:cs="Aptos"/>
+                <w:color w:val="000000" w:themeColor="text1"/>
+                <w:sz w:val="24"/>
+                <w:szCs w:val="24"/>
+              </w:rPr>
+              <w:t xml:space="preserve">Data Cleaning </w:t>
+            </w:r>
+          </w:p>
+          <w:p>
+            <w:r>
+              <w:rPr>
+                <w:rFonts w:ascii="Aptos" w:eastAsia="Aptos" w:hAnsi="Aptos" w:cs="Aptos"/>
+                <w:color w:val="000000" w:themeColor="text1"/>
+                <w:sz w:val="24"/>
+                <w:szCs w:val="24"/>
+              </w:rPr>
+              <w:t>10- Visualize the dependent variable by the Graph/Chart of the following using Python Program</w:t>
+            </w:r>
+          </w:p>
+          <w:p>
+            <w:r>
+              <w:rPr>
+                <w:rFonts w:ascii="Aptos" w:eastAsia="Aptos" w:hAnsi="Aptos" w:cs="Aptos"/>
+                <w:color w:val="000000" w:themeColor="text1"/>
+                <w:sz w:val="24"/>
+                <w:szCs w:val="24"/>
+              </w:rPr>
+              <w:t xml:space="preserve">14- Develop a script to forecast the value of the dependent variable from all the relevant independent variables using Multiple Linear Regression </w:t>
+            </w:r>
+          </w:p>
+          <w:p>
+            <w:r>
+              <w:rPr>
+                <w:rFonts w:ascii="Aptos" w:eastAsia="Aptos" w:hAnsi="Aptos" w:cs="Aptos"/>
+                <w:color w:val="000000" w:themeColor="text1"/>
+                <w:sz w:val="24"/>
+                <w:szCs w:val="24"/>
+              </w:rPr>
+              <w:lastRenderedPageBreak/>
+              <w:t xml:space="preserve">18- Perform the cluster analysis such as K-means and Horizontal for any field from the chosen dataset. </w:t>
+            </w:r>
+          </w:p>
+          <w:p>
+            <w:pPr>
+              <w:pStyle w:val="ListParagraph"/>
+              <w:ind w:left="720"/>
+              <w:rPr>
+                <w:rFonts w:ascii="Aptos" w:eastAsia="Aptos" w:hAnsi="Aptos" w:cs="Aptos"/>
+                <w:color w:val="000000" w:themeColor="text1"/>
+                <w:sz w:val="24"/>
+                <w:szCs w:val="24"/>
+              </w:rPr>
+            </w:pPr>
+            <w:r>
+              <w:rPr>
+                <w:rFonts w:ascii="Aptos" w:eastAsia="Aptos" w:hAnsi="Aptos" w:cs="Aptos"/>
+                <w:color w:val="000000" w:themeColor="text1"/>
+                <w:sz w:val="24"/>
+                <w:szCs w:val="24"/>
+              </w:rPr>
+              <w:t>Conclusion and Summary</w:t>
+            </w:r>
+          </w:p>
+        </w:tc>
+      </w:tr>
+    </w:tbl>
+    <w:p>
+      <w:pPr>
+        <w:spacing w:after="0"/>
+      </w:pPr>
+      <w:r>
+        <w:rPr>
+          <w:rFonts w:ascii="Aptos" w:eastAsia="Aptos" w:hAnsi="Aptos" w:cs="Aptos"/>
+          <w:color w:val="000000" w:themeColor="text1"/>
+        </w:rPr>
+        <w:lastRenderedPageBreak/>
+        <w:t xml:space="preserve"> </w:t>
+      </w:r>
+    </w:p>
+    <w:p>
+      <w:pPr>
+        <w:spacing w:after="160" w:line="276" w:lineRule="auto"/>
+        <w:rPr>
+          <w:rFonts w:ascii="Aptos" w:eastAsia="Aptos" w:hAnsi="Aptos" w:cs="Aptos"/>
+          <w:color w:val="000000" w:themeColor="text1"/>
+        </w:rPr>
+      </w:pPr>
+    </w:p>
+    <w:p>
+      <w:pPr>
+        <w:sectPr>
+          <w:headerReference w:type="default" r:id="rId54"/>
+          <w:footerReference w:type="default" r:id="rId55"/>
+          <w:pgSz w:w="11910" w:h="16840"/>
+          <w:pgMar w:top="2160" w:right="1440" w:bottom="1440" w:left="1440" w:header="720" w:footer="399" w:gutter="0"/>
+          <w:cols w:space="720"/>
+          <w:docGrid w:linePitch="299"/>
+        </w:sectPr>
+      </w:pPr>
     </w:p>
     <w:p>
       <w:pPr>
@@ -39218,6 +40818,119 @@
     </w:lvl>
   </w:abstractNum>
   <w:abstractNum w:abstractNumId="15" w15:restartNumberingAfterBreak="0">
+    <w:nsid w:val="235E1E2A"/>
+    <w:multiLevelType w:val="hybridMultilevel"/>
+    <w:tmpl w:val="8DAEF01C"/>
+    <w:lvl w:ilvl="0" w:tplc="EC8E8C70">
+      <w:start w:val="1"/>
+      <w:numFmt w:val="bullet"/>
+      <w:lvlText w:val="-"/>
+      <w:lvlJc w:val="left"/>
+      <w:pPr>
+        <w:ind w:left="720" w:hanging="360"/>
+      </w:pPr>
+      <w:rPr>
+        <w:rFonts w:ascii="&quot;Times New Roman&quot;, serif" w:hAnsi="&quot;Times New Roman&quot;, serif" w:hint="default"/>
+      </w:rPr>
+    </w:lvl>
+    <w:lvl w:ilvl="1" w:tplc="1B3056EA">
+      <w:start w:val="1"/>
+      <w:numFmt w:val="bullet"/>
+      <w:lvlText w:val="o"/>
+      <w:lvlJc w:val="left"/>
+      <w:pPr>
+        <w:ind w:left="1440" w:hanging="360"/>
+      </w:pPr>
+      <w:rPr>
+        <w:rFonts w:ascii="Courier New" w:hAnsi="Courier New" w:hint="default"/>
+      </w:rPr>
+    </w:lvl>
+    <w:lvl w:ilvl="2" w:tplc="D236092A">
+      <w:start w:val="1"/>
+      <w:numFmt w:val="bullet"/>
+      <w:lvlText w:val=""/>
+      <w:lvlJc w:val="left"/>
+      <w:pPr>
+        <w:ind w:left="2160" w:hanging="360"/>
+      </w:pPr>
+      <w:rPr>
+        <w:rFonts w:ascii="Wingdings" w:hAnsi="Wingdings" w:hint="default"/>
+      </w:rPr>
+    </w:lvl>
+    <w:lvl w:ilvl="3" w:tplc="E9E0E060">
+      <w:start w:val="1"/>
+      <w:numFmt w:val="bullet"/>
+      <w:lvlText w:val=""/>
+      <w:lvlJc w:val="left"/>
+      <w:pPr>
+        <w:ind w:left="2880" w:hanging="360"/>
+      </w:pPr>
+      <w:rPr>
+        <w:rFonts w:ascii="Symbol" w:hAnsi="Symbol" w:hint="default"/>
+      </w:rPr>
+    </w:lvl>
+    <w:lvl w:ilvl="4" w:tplc="7616C28E">
+      <w:start w:val="1"/>
+      <w:numFmt w:val="bullet"/>
+      <w:lvlText w:val="o"/>
+      <w:lvlJc w:val="left"/>
+      <w:pPr>
+        <w:ind w:left="3600" w:hanging="360"/>
+      </w:pPr>
+      <w:rPr>
+        <w:rFonts w:ascii="Courier New" w:hAnsi="Courier New" w:hint="default"/>
+      </w:rPr>
+    </w:lvl>
+    <w:lvl w:ilvl="5" w:tplc="35C4FC74">
+      <w:start w:val="1"/>
+      <w:numFmt w:val="bullet"/>
+      <w:lvlText w:val=""/>
+      <w:lvlJc w:val="left"/>
+      <w:pPr>
+        <w:ind w:left="4320" w:hanging="360"/>
+      </w:pPr>
+      <w:rPr>
+        <w:rFonts w:ascii="Wingdings" w:hAnsi="Wingdings" w:hint="default"/>
+      </w:rPr>
+    </w:lvl>
+    <w:lvl w:ilvl="6" w:tplc="A094F94A">
+      <w:start w:val="1"/>
+      <w:numFmt w:val="bullet"/>
+      <w:lvlText w:val=""/>
+      <w:lvlJc w:val="left"/>
+      <w:pPr>
+        <w:ind w:left="5040" w:hanging="360"/>
+      </w:pPr>
+      <w:rPr>
+        <w:rFonts w:ascii="Symbol" w:hAnsi="Symbol" w:hint="default"/>
+      </w:rPr>
+    </w:lvl>
+    <w:lvl w:ilvl="7" w:tplc="18BE89C4">
+      <w:start w:val="1"/>
+      <w:numFmt w:val="bullet"/>
+      <w:lvlText w:val="o"/>
+      <w:lvlJc w:val="left"/>
+      <w:pPr>
+        <w:ind w:left="5760" w:hanging="360"/>
+      </w:pPr>
+      <w:rPr>
+        <w:rFonts w:ascii="Courier New" w:hAnsi="Courier New" w:hint="default"/>
+      </w:rPr>
+    </w:lvl>
+    <w:lvl w:ilvl="8" w:tplc="963AC15A">
+      <w:start w:val="1"/>
+      <w:numFmt w:val="bullet"/>
+      <w:lvlText w:val=""/>
+      <w:lvlJc w:val="left"/>
+      <w:pPr>
+        <w:ind w:left="6480" w:hanging="360"/>
+      </w:pPr>
+      <w:rPr>
+        <w:rFonts w:ascii="Wingdings" w:hAnsi="Wingdings" w:hint="default"/>
+      </w:rPr>
+    </w:lvl>
+  </w:abstractNum>
+  <w:abstractNum w:abstractNumId="16" w15:restartNumberingAfterBreak="0">
     <w:nsid w:val="23970C28"/>
     <w:multiLevelType w:val="multilevel"/>
     <w:tmpl w:val="007878A4"/>
@@ -39366,7 +41079,7 @@
       </w:rPr>
     </w:lvl>
   </w:abstractNum>
-  <w:abstractNum w:abstractNumId="16" w15:restartNumberingAfterBreak="0">
+  <w:abstractNum w:abstractNumId="17" w15:restartNumberingAfterBreak="0">
     <w:nsid w:val="283823AA"/>
     <w:multiLevelType w:val="hybridMultilevel"/>
     <w:tmpl w:val="AFAE3F88"/>
@@ -39452,7 +41165,7 @@
       </w:pPr>
     </w:lvl>
   </w:abstractNum>
-  <w:abstractNum w:abstractNumId="17" w15:restartNumberingAfterBreak="0">
+  <w:abstractNum w:abstractNumId="18" w15:restartNumberingAfterBreak="0">
     <w:nsid w:val="297824C5"/>
     <w:multiLevelType w:val="hybridMultilevel"/>
     <w:tmpl w:val="B0765354"/>
@@ -39546,7 +41259,7 @@
       </w:pPr>
     </w:lvl>
   </w:abstractNum>
-  <w:abstractNum w:abstractNumId="18" w15:restartNumberingAfterBreak="0">
+  <w:abstractNum w:abstractNumId="19" w15:restartNumberingAfterBreak="0">
     <w:nsid w:val="29961BC5"/>
     <w:multiLevelType w:val="hybridMultilevel"/>
     <w:tmpl w:val="97121430"/>
@@ -39635,7 +41348,7 @@
       </w:pPr>
     </w:lvl>
   </w:abstractNum>
-  <w:abstractNum w:abstractNumId="19" w15:restartNumberingAfterBreak="0">
+  <w:abstractNum w:abstractNumId="20" w15:restartNumberingAfterBreak="0">
     <w:nsid w:val="2F11533D"/>
     <w:multiLevelType w:val="multilevel"/>
     <w:tmpl w:val="168A13E8"/>
@@ -39784,7 +41497,7 @@
       </w:rPr>
     </w:lvl>
   </w:abstractNum>
-  <w:abstractNum w:abstractNumId="20" w15:restartNumberingAfterBreak="0">
+  <w:abstractNum w:abstractNumId="21" w15:restartNumberingAfterBreak="0">
     <w:nsid w:val="355650F3"/>
     <w:multiLevelType w:val="multilevel"/>
     <w:tmpl w:val="9D4ACBC2"/>
@@ -39933,7 +41646,7 @@
       </w:rPr>
     </w:lvl>
   </w:abstractNum>
-  <w:abstractNum w:abstractNumId="21" w15:restartNumberingAfterBreak="0">
+  <w:abstractNum w:abstractNumId="22" w15:restartNumberingAfterBreak="0">
     <w:nsid w:val="3F236423"/>
     <w:multiLevelType w:val="hybridMultilevel"/>
     <w:tmpl w:val="8B666C6A"/>
@@ -40022,7 +41735,7 @@
       </w:pPr>
     </w:lvl>
   </w:abstractNum>
-  <w:abstractNum w:abstractNumId="22" w15:restartNumberingAfterBreak="0">
+  <w:abstractNum w:abstractNumId="23" w15:restartNumberingAfterBreak="0">
     <w:nsid w:val="3F79578C"/>
     <w:multiLevelType w:val="multilevel"/>
     <w:tmpl w:val="A5AC616E"/>
@@ -40171,7 +41884,7 @@
       </w:rPr>
     </w:lvl>
   </w:abstractNum>
-  <w:abstractNum w:abstractNumId="23" w15:restartNumberingAfterBreak="0">
+  <w:abstractNum w:abstractNumId="24" w15:restartNumberingAfterBreak="0">
     <w:nsid w:val="454E1117"/>
     <w:multiLevelType w:val="hybridMultilevel"/>
     <w:tmpl w:val="A366FDF6"/>
@@ -40284,7 +41997,7 @@
       </w:rPr>
     </w:lvl>
   </w:abstractNum>
-  <w:abstractNum w:abstractNumId="24" w15:restartNumberingAfterBreak="0">
+  <w:abstractNum w:abstractNumId="25" w15:restartNumberingAfterBreak="0">
     <w:nsid w:val="45701D12"/>
     <w:multiLevelType w:val="hybridMultilevel"/>
     <w:tmpl w:val="9B967240"/>
@@ -40377,7 +42090,7 @@
       </w:pPr>
     </w:lvl>
   </w:abstractNum>
-  <w:abstractNum w:abstractNumId="25" w15:restartNumberingAfterBreak="0">
+  <w:abstractNum w:abstractNumId="26" w15:restartNumberingAfterBreak="0">
     <w:nsid w:val="472F071B"/>
     <w:multiLevelType w:val="multilevel"/>
     <w:tmpl w:val="8F60FB98"/>
@@ -40526,7 +42239,120 @@
       </w:rPr>
     </w:lvl>
   </w:abstractNum>
-  <w:abstractNum w:abstractNumId="26" w15:restartNumberingAfterBreak="0">
+  <w:abstractNum w:abstractNumId="27" w15:restartNumberingAfterBreak="0">
+    <w:nsid w:val="4A023B38"/>
+    <w:multiLevelType w:val="hybridMultilevel"/>
+    <w:tmpl w:val="460A4F18"/>
+    <w:lvl w:ilvl="0" w:tplc="C162486E">
+      <w:start w:val="1"/>
+      <w:numFmt w:val="bullet"/>
+      <w:lvlText w:val="-"/>
+      <w:lvlJc w:val="left"/>
+      <w:pPr>
+        <w:ind w:left="720" w:hanging="360"/>
+      </w:pPr>
+      <w:rPr>
+        <w:rFonts w:ascii="Symbol" w:hAnsi="Symbol" w:hint="default"/>
+      </w:rPr>
+    </w:lvl>
+    <w:lvl w:ilvl="1" w:tplc="2496D242">
+      <w:start w:val="1"/>
+      <w:numFmt w:val="bullet"/>
+      <w:lvlText w:val="o"/>
+      <w:lvlJc w:val="left"/>
+      <w:pPr>
+        <w:ind w:left="1440" w:hanging="360"/>
+      </w:pPr>
+      <w:rPr>
+        <w:rFonts w:ascii="Courier New" w:hAnsi="Courier New" w:hint="default"/>
+      </w:rPr>
+    </w:lvl>
+    <w:lvl w:ilvl="2" w:tplc="D054A292">
+      <w:start w:val="1"/>
+      <w:numFmt w:val="bullet"/>
+      <w:lvlText w:val=""/>
+      <w:lvlJc w:val="left"/>
+      <w:pPr>
+        <w:ind w:left="2160" w:hanging="360"/>
+      </w:pPr>
+      <w:rPr>
+        <w:rFonts w:ascii="Wingdings" w:hAnsi="Wingdings" w:hint="default"/>
+      </w:rPr>
+    </w:lvl>
+    <w:lvl w:ilvl="3" w:tplc="2C7291AC">
+      <w:start w:val="1"/>
+      <w:numFmt w:val="bullet"/>
+      <w:lvlText w:val=""/>
+      <w:lvlJc w:val="left"/>
+      <w:pPr>
+        <w:ind w:left="2880" w:hanging="360"/>
+      </w:pPr>
+      <w:rPr>
+        <w:rFonts w:ascii="Symbol" w:hAnsi="Symbol" w:hint="default"/>
+      </w:rPr>
+    </w:lvl>
+    <w:lvl w:ilvl="4" w:tplc="E620E45E">
+      <w:start w:val="1"/>
+      <w:numFmt w:val="bullet"/>
+      <w:lvlText w:val="o"/>
+      <w:lvlJc w:val="left"/>
+      <w:pPr>
+        <w:ind w:left="3600" w:hanging="360"/>
+      </w:pPr>
+      <w:rPr>
+        <w:rFonts w:ascii="Courier New" w:hAnsi="Courier New" w:hint="default"/>
+      </w:rPr>
+    </w:lvl>
+    <w:lvl w:ilvl="5" w:tplc="9AB0E238">
+      <w:start w:val="1"/>
+      <w:numFmt w:val="bullet"/>
+      <w:lvlText w:val=""/>
+      <w:lvlJc w:val="left"/>
+      <w:pPr>
+        <w:ind w:left="4320" w:hanging="360"/>
+      </w:pPr>
+      <w:rPr>
+        <w:rFonts w:ascii="Wingdings" w:hAnsi="Wingdings" w:hint="default"/>
+      </w:rPr>
+    </w:lvl>
+    <w:lvl w:ilvl="6" w:tplc="03EA7DA6">
+      <w:start w:val="1"/>
+      <w:numFmt w:val="bullet"/>
+      <w:lvlText w:val=""/>
+      <w:lvlJc w:val="left"/>
+      <w:pPr>
+        <w:ind w:left="5040" w:hanging="360"/>
+      </w:pPr>
+      <w:rPr>
+        <w:rFonts w:ascii="Symbol" w:hAnsi="Symbol" w:hint="default"/>
+      </w:rPr>
+    </w:lvl>
+    <w:lvl w:ilvl="7" w:tplc="EEF02A5E">
+      <w:start w:val="1"/>
+      <w:numFmt w:val="bullet"/>
+      <w:lvlText w:val="o"/>
+      <w:lvlJc w:val="left"/>
+      <w:pPr>
+        <w:ind w:left="5760" w:hanging="360"/>
+      </w:pPr>
+      <w:rPr>
+        <w:rFonts w:ascii="Courier New" w:hAnsi="Courier New" w:hint="default"/>
+      </w:rPr>
+    </w:lvl>
+    <w:lvl w:ilvl="8" w:tplc="B310FF04">
+      <w:start w:val="1"/>
+      <w:numFmt w:val="bullet"/>
+      <w:lvlText w:val=""/>
+      <w:lvlJc w:val="left"/>
+      <w:pPr>
+        <w:ind w:left="6480" w:hanging="360"/>
+      </w:pPr>
+      <w:rPr>
+        <w:rFonts w:ascii="Wingdings" w:hAnsi="Wingdings" w:hint="default"/>
+      </w:rPr>
+    </w:lvl>
+  </w:abstractNum>
+  <w:abstractNum w:abstractNumId="28" w15:restartNumberingAfterBreak="0">
     <w:nsid w:val="51253BBE"/>
     <w:multiLevelType w:val="multilevel"/>
     <w:tmpl w:val="7312100E"/>
@@ -40675,7 +42501,7 @@
       </w:rPr>
     </w:lvl>
   </w:abstractNum>
-  <w:abstractNum w:abstractNumId="27" w15:restartNumberingAfterBreak="0">
+  <w:abstractNum w:abstractNumId="29" w15:restartNumberingAfterBreak="0">
     <w:nsid w:val="56571D92"/>
     <w:multiLevelType w:val="multilevel"/>
     <w:tmpl w:val="5980D5C2"/>
@@ -40788,7 +42614,7 @@
       </w:pPr>
     </w:lvl>
   </w:abstractNum>
-  <w:abstractNum w:abstractNumId="28" w15:restartNumberingAfterBreak="0">
+  <w:abstractNum w:abstractNumId="30" w15:restartNumberingAfterBreak="0">
     <w:nsid w:val="57E95FF7"/>
     <w:multiLevelType w:val="multilevel"/>
     <w:tmpl w:val="98BAC0CE"/>
@@ -40937,7 +42763,7 @@
       </w:rPr>
     </w:lvl>
   </w:abstractNum>
-  <w:abstractNum w:abstractNumId="29" w15:restartNumberingAfterBreak="0">
+  <w:abstractNum w:abstractNumId="31" w15:restartNumberingAfterBreak="0">
     <w:nsid w:val="5BF80F37"/>
     <w:multiLevelType w:val="multilevel"/>
     <w:tmpl w:val="E85218EA"/>
@@ -41086,7 +42912,7 @@
       </w:rPr>
     </w:lvl>
   </w:abstractNum>
-  <w:abstractNum w:abstractNumId="30" w15:restartNumberingAfterBreak="0">
+  <w:abstractNum w:abstractNumId="32" w15:restartNumberingAfterBreak="0">
     <w:nsid w:val="5C296CFE"/>
     <w:multiLevelType w:val="hybridMultilevel"/>
     <w:tmpl w:val="225C694E"/>
@@ -41143,7 +42969,7 @@
       <w:lvlJc w:val="left"/>
     </w:lvl>
   </w:abstractNum>
-  <w:abstractNum w:abstractNumId="31" w15:restartNumberingAfterBreak="0">
+  <w:abstractNum w:abstractNumId="33" w15:restartNumberingAfterBreak="0">
     <w:nsid w:val="608103A2"/>
     <w:multiLevelType w:val="multilevel"/>
     <w:tmpl w:val="2BD4DD96"/>
@@ -41292,7 +43118,7 @@
       </w:rPr>
     </w:lvl>
   </w:abstractNum>
-  <w:abstractNum w:abstractNumId="32" w15:restartNumberingAfterBreak="0">
+  <w:abstractNum w:abstractNumId="34" w15:restartNumberingAfterBreak="0">
     <w:nsid w:val="60BA1517"/>
     <w:multiLevelType w:val="hybridMultilevel"/>
     <w:tmpl w:val="7B2E2850"/>
@@ -41405,7 +43231,120 @@
       </w:rPr>
     </w:lvl>
   </w:abstractNum>
-  <w:abstractNum w:abstractNumId="33" w15:restartNumberingAfterBreak="0">
+  <w:abstractNum w:abstractNumId="35" w15:restartNumberingAfterBreak="0">
+    <w:nsid w:val="63680279"/>
+    <w:multiLevelType w:val="hybridMultilevel"/>
+    <w:tmpl w:val="D67C14FC"/>
+    <w:lvl w:ilvl="0" w:tplc="84064EC4">
+      <w:start w:val="1"/>
+      <w:numFmt w:val="bullet"/>
+      <w:lvlText w:val="-"/>
+      <w:lvlJc w:val="left"/>
+      <w:pPr>
+        <w:ind w:left="720" w:hanging="360"/>
+      </w:pPr>
+      <w:rPr>
+        <w:rFonts w:ascii="Symbol" w:hAnsi="Symbol" w:hint="default"/>
+      </w:rPr>
+    </w:lvl>
+    <w:lvl w:ilvl="1" w:tplc="33860004">
+      <w:start w:val="1"/>
+      <w:numFmt w:val="bullet"/>
+      <w:lvlText w:val="o"/>
+      <w:lvlJc w:val="left"/>
+      <w:pPr>
+        <w:ind w:left="1440" w:hanging="360"/>
+      </w:pPr>
+      <w:rPr>
+        <w:rFonts w:ascii="Courier New" w:hAnsi="Courier New" w:hint="default"/>
+      </w:rPr>
+    </w:lvl>
+    <w:lvl w:ilvl="2" w:tplc="06F2E580">
+      <w:start w:val="1"/>
+      <w:numFmt w:val="bullet"/>
+      <w:lvlText w:val=""/>
+      <w:lvlJc w:val="left"/>
+      <w:pPr>
+        <w:ind w:left="2160" w:hanging="360"/>
+      </w:pPr>
+      <w:rPr>
+        <w:rFonts w:ascii="Wingdings" w:hAnsi="Wingdings" w:hint="default"/>
+      </w:rPr>
+    </w:lvl>
+    <w:lvl w:ilvl="3" w:tplc="DC66C0C6">
+      <w:start w:val="1"/>
+      <w:numFmt w:val="bullet"/>
+      <w:lvlText w:val=""/>
+      <w:lvlJc w:val="left"/>
+      <w:pPr>
+        <w:ind w:left="2880" w:hanging="360"/>
+      </w:pPr>
+      <w:rPr>
+        <w:rFonts w:ascii="Symbol" w:hAnsi="Symbol" w:hint="default"/>
+      </w:rPr>
+    </w:lvl>
+    <w:lvl w:ilvl="4" w:tplc="03089310">
+      <w:start w:val="1"/>
+      <w:numFmt w:val="bullet"/>
+      <w:lvlText w:val="o"/>
+      <w:lvlJc w:val="left"/>
+      <w:pPr>
+        <w:ind w:left="3600" w:hanging="360"/>
+      </w:pPr>
+      <w:rPr>
+        <w:rFonts w:ascii="Courier New" w:hAnsi="Courier New" w:hint="default"/>
+      </w:rPr>
+    </w:lvl>
+    <w:lvl w:ilvl="5" w:tplc="3AA2CAEC">
+      <w:start w:val="1"/>
+      <w:numFmt w:val="bullet"/>
+      <w:lvlText w:val=""/>
+      <w:lvlJc w:val="left"/>
+      <w:pPr>
+        <w:ind w:left="4320" w:hanging="360"/>
+      </w:pPr>
+      <w:rPr>
+        <w:rFonts w:ascii="Wingdings" w:hAnsi="Wingdings" w:hint="default"/>
+      </w:rPr>
+    </w:lvl>
+    <w:lvl w:ilvl="6" w:tplc="7CDA1A38">
+      <w:start w:val="1"/>
+      <w:numFmt w:val="bullet"/>
+      <w:lvlText w:val=""/>
+      <w:lvlJc w:val="left"/>
+      <w:pPr>
+        <w:ind w:left="5040" w:hanging="360"/>
+      </w:pPr>
+      <w:rPr>
+        <w:rFonts w:ascii="Symbol" w:hAnsi="Symbol" w:hint="default"/>
+      </w:rPr>
+    </w:lvl>
+    <w:lvl w:ilvl="7" w:tplc="2578F54C">
+      <w:start w:val="1"/>
+      <w:numFmt w:val="bullet"/>
+      <w:lvlText w:val="o"/>
+      <w:lvlJc w:val="left"/>
+      <w:pPr>
+        <w:ind w:left="5760" w:hanging="360"/>
+      </w:pPr>
+      <w:rPr>
+        <w:rFonts w:ascii="Courier New" w:hAnsi="Courier New" w:hint="default"/>
+      </w:rPr>
+    </w:lvl>
+    <w:lvl w:ilvl="8" w:tplc="0F1025B2">
+      <w:start w:val="1"/>
+      <w:numFmt w:val="bullet"/>
+      <w:lvlText w:val=""/>
+      <w:lvlJc w:val="left"/>
+      <w:pPr>
+        <w:ind w:left="6480" w:hanging="360"/>
+      </w:pPr>
+      <w:rPr>
+        <w:rFonts w:ascii="Wingdings" w:hAnsi="Wingdings" w:hint="default"/>
+      </w:rPr>
+    </w:lvl>
+  </w:abstractNum>
+  <w:abstractNum w:abstractNumId="36" w15:restartNumberingAfterBreak="0">
     <w:nsid w:val="6A674677"/>
     <w:multiLevelType w:val="hybridMultilevel"/>
     <w:tmpl w:val="F7F4155E"/>
@@ -41518,7 +43457,7 @@
       </w:rPr>
     </w:lvl>
   </w:abstractNum>
-  <w:abstractNum w:abstractNumId="34" w15:restartNumberingAfterBreak="0">
+  <w:abstractNum w:abstractNumId="37" w15:restartNumberingAfterBreak="0">
     <w:nsid w:val="731F48DC"/>
     <w:multiLevelType w:val="hybridMultilevel"/>
     <w:tmpl w:val="69D6B8DE"/>
@@ -41607,7 +43546,7 @@
       </w:pPr>
     </w:lvl>
   </w:abstractNum>
-  <w:abstractNum w:abstractNumId="35" w15:restartNumberingAfterBreak="0">
+  <w:abstractNum w:abstractNumId="38" w15:restartNumberingAfterBreak="0">
     <w:nsid w:val="73F25C23"/>
     <w:multiLevelType w:val="hybridMultilevel"/>
     <w:tmpl w:val="2444BA62"/>
@@ -41720,7 +43659,7 @@
       </w:rPr>
     </w:lvl>
   </w:abstractNum>
-  <w:abstractNum w:abstractNumId="36" w15:restartNumberingAfterBreak="0">
+  <w:abstractNum w:abstractNumId="39" w15:restartNumberingAfterBreak="0">
     <w:nsid w:val="77194A8C"/>
     <w:multiLevelType w:val="hybridMultilevel"/>
     <w:tmpl w:val="6B646840"/>
@@ -41812,7 +43751,7 @@
       </w:pPr>
     </w:lvl>
   </w:abstractNum>
-  <w:abstractNum w:abstractNumId="37" w15:restartNumberingAfterBreak="0">
+  <w:abstractNum w:abstractNumId="40" w15:restartNumberingAfterBreak="0">
     <w:nsid w:val="79911088"/>
     <w:multiLevelType w:val="hybridMultilevel"/>
     <w:tmpl w:val="B89254AA"/>
@@ -41926,7 +43865,7 @@
       </w:rPr>
     </w:lvl>
   </w:abstractNum>
-  <w:abstractNum w:abstractNumId="38" w15:restartNumberingAfterBreak="0">
+  <w:abstractNum w:abstractNumId="41" w15:restartNumberingAfterBreak="0">
     <w:nsid w:val="7B6B11D7"/>
     <w:multiLevelType w:val="multilevel"/>
     <w:tmpl w:val="36F609D6"/>
@@ -42075,7 +44014,7 @@
       </w:rPr>
     </w:lvl>
   </w:abstractNum>
-  <w:abstractNum w:abstractNumId="39" w15:restartNumberingAfterBreak="0">
+  <w:abstractNum w:abstractNumId="42" w15:restartNumberingAfterBreak="0">
     <w:nsid w:val="7E97364B"/>
     <w:multiLevelType w:val="multilevel"/>
     <w:tmpl w:val="5802BDD8"/>
@@ -42225,10 +44164,10 @@
     </w:lvl>
   </w:abstractNum>
   <w:num w:numId="1" w16cid:durableId="1871795622">
-    <w:abstractNumId w:val="24"/>
+    <w:abstractNumId w:val="25"/>
   </w:num>
   <w:num w:numId="2" w16cid:durableId="1781101566">
-    <w:abstractNumId w:val="37"/>
+    <w:abstractNumId w:val="40"/>
   </w:num>
   <w:num w:numId="3" w16cid:durableId="124927747">
     <w:abstractNumId w:val="8"/>
@@ -42237,58 +44176,58 @@
     <w:abstractNumId w:val="11"/>
   </w:num>
   <w:num w:numId="5" w16cid:durableId="592251446">
-    <w:abstractNumId w:val="32"/>
+    <w:abstractNumId w:val="34"/>
   </w:num>
   <w:num w:numId="6" w16cid:durableId="2077169243">
-    <w:abstractNumId w:val="35"/>
+    <w:abstractNumId w:val="38"/>
   </w:num>
   <w:num w:numId="7" w16cid:durableId="1747337124">
     <w:abstractNumId w:val="5"/>
   </w:num>
   <w:num w:numId="8" w16cid:durableId="1406881650">
-    <w:abstractNumId w:val="33"/>
+    <w:abstractNumId w:val="36"/>
   </w:num>
   <w:num w:numId="9" w16cid:durableId="1611352711">
     <w:abstractNumId w:val="0"/>
   </w:num>
   <w:num w:numId="10" w16cid:durableId="171720247">
-    <w:abstractNumId w:val="22"/>
+    <w:abstractNumId w:val="23"/>
   </w:num>
   <w:num w:numId="11" w16cid:durableId="1267955887">
     <w:abstractNumId w:val="1"/>
   </w:num>
   <w:num w:numId="12" w16cid:durableId="745154019">
-    <w:abstractNumId w:val="20"/>
+    <w:abstractNumId w:val="21"/>
   </w:num>
   <w:num w:numId="13" w16cid:durableId="913393587">
-    <w:abstractNumId w:val="31"/>
+    <w:abstractNumId w:val="33"/>
   </w:num>
   <w:num w:numId="14" w16cid:durableId="490101700">
-    <w:abstractNumId w:val="28"/>
+    <w:abstractNumId w:val="30"/>
   </w:num>
   <w:num w:numId="15" w16cid:durableId="1572034469">
-    <w:abstractNumId w:val="25"/>
+    <w:abstractNumId w:val="26"/>
   </w:num>
   <w:num w:numId="16" w16cid:durableId="292055016">
-    <w:abstractNumId w:val="19"/>
+    <w:abstractNumId w:val="20"/>
   </w:num>
   <w:num w:numId="17" w16cid:durableId="576666986">
     <w:abstractNumId w:val="3"/>
   </w:num>
   <w:num w:numId="18" w16cid:durableId="645863933">
-    <w:abstractNumId w:val="29"/>
+    <w:abstractNumId w:val="31"/>
   </w:num>
   <w:num w:numId="19" w16cid:durableId="1842545079">
-    <w:abstractNumId w:val="21"/>
+    <w:abstractNumId w:val="22"/>
   </w:num>
   <w:num w:numId="20" w16cid:durableId="419644712">
-    <w:abstractNumId w:val="36"/>
+    <w:abstractNumId w:val="39"/>
   </w:num>
   <w:num w:numId="21" w16cid:durableId="152377015">
-    <w:abstractNumId w:val="16"/>
+    <w:abstractNumId w:val="17"/>
   </w:num>
   <w:num w:numId="22" w16cid:durableId="1601570237">
-    <w:abstractNumId w:val="23"/>
+    <w:abstractNumId w:val="24"/>
   </w:num>
   <w:num w:numId="23" w16cid:durableId="2101947269">
     <w:abstractNumId w:val="14"/>
@@ -42297,7 +44236,7 @@
     <w:abstractNumId w:val="6"/>
   </w:num>
   <w:num w:numId="25" w16cid:durableId="891968695">
-    <w:abstractNumId w:val="30"/>
+    <w:abstractNumId w:val="32"/>
   </w:num>
   <w:num w:numId="26" w16cid:durableId="147286228">
     <w:abstractNumId w:val="10"/>
@@ -42306,22 +44245,22 @@
     <w:abstractNumId w:val="2"/>
   </w:num>
   <w:num w:numId="28" w16cid:durableId="584001386">
-    <w:abstractNumId w:val="38"/>
+    <w:abstractNumId w:val="41"/>
   </w:num>
   <w:num w:numId="29" w16cid:durableId="1121535586">
-    <w:abstractNumId w:val="39"/>
+    <w:abstractNumId w:val="42"/>
   </w:num>
   <w:num w:numId="30" w16cid:durableId="1167131464">
     <w:abstractNumId w:val="13"/>
   </w:num>
   <w:num w:numId="31" w16cid:durableId="2088843898">
-    <w:abstractNumId w:val="15"/>
+    <w:abstractNumId w:val="16"/>
   </w:num>
   <w:num w:numId="32" w16cid:durableId="619142249">
-    <w:abstractNumId w:val="27"/>
+    <w:abstractNumId w:val="29"/>
   </w:num>
   <w:num w:numId="33" w16cid:durableId="645277576">
-    <w:abstractNumId w:val="27"/>
+    <w:abstractNumId w:val="29"/>
     <w:lvlOverride w:ilvl="1">
       <w:lvl w:ilvl="1">
         <w:numFmt w:val="lowerLetter"/>
@@ -42334,7 +44273,7 @@
     <w:abstractNumId w:val="7"/>
   </w:num>
   <w:num w:numId="35" w16cid:durableId="1557427117">
-    <w:abstractNumId w:val="18"/>
+    <w:abstractNumId w:val="19"/>
   </w:num>
   <w:num w:numId="36" w16cid:durableId="1311666918">
     <w:abstractNumId w:val="4"/>
@@ -42343,16 +44282,25 @@
     <w:abstractNumId w:val="12"/>
   </w:num>
   <w:num w:numId="38" w16cid:durableId="608464979">
-    <w:abstractNumId w:val="17"/>
+    <w:abstractNumId w:val="18"/>
   </w:num>
   <w:num w:numId="39" w16cid:durableId="759061581">
     <w:abstractNumId w:val="9"/>
   </w:num>
   <w:num w:numId="40" w16cid:durableId="1218517174">
-    <w:abstractNumId w:val="34"/>
+    <w:abstractNumId w:val="37"/>
   </w:num>
   <w:num w:numId="41" w16cid:durableId="900138226">
-    <w:abstractNumId w:val="26"/>
+    <w:abstractNumId w:val="28"/>
+  </w:num>
+  <w:num w:numId="42" w16cid:durableId="1341850619">
+    <w:abstractNumId w:val="27"/>
+  </w:num>
+  <w:num w:numId="43" w16cid:durableId="1107964062">
+    <w:abstractNumId w:val="35"/>
+  </w:num>
+  <w:num w:numId="44" w16cid:durableId="1537963822">
+    <w:abstractNumId w:val="15"/>
   </w:num>
   <w:numIdMacAtCleanup w:val="19"/>
 </w:numbering>
@@ -44523,27 +46471,10 @@
 </file>
 
 <file path=customXml/item1.xml><?xml version="1.0" encoding="utf-8"?>
-<?mso-contentType ?>
-<FormTemplates xmlns="http://schemas.microsoft.com/sharepoint/v3/contenttype/forms">
-  <Display>DocumentLibraryForm</Display>
-  <Edit>DocumentLibraryForm</Edit>
-  <New>DocumentLibraryForm</New>
-</FormTemplates>
+<b:Sources xmlns:b="http://schemas.openxmlformats.org/officeDocument/2006/bibliography" xmlns="http://schemas.openxmlformats.org/officeDocument/2006/bibliography" SelectedStyle="\APASixthEditionOfficeOnline.xsl" StyleName="APA" Version="6"/>
 </file>
 
 <file path=customXml/item2.xml><?xml version="1.0" encoding="utf-8"?>
-<b:Sources xmlns:b="http://schemas.openxmlformats.org/officeDocument/2006/bibliography" xmlns="http://schemas.openxmlformats.org/officeDocument/2006/bibliography" SelectedStyle="\APASixthEditionOfficeOnline.xsl" StyleName="APA" Version="6"/>
-</file>
-
-<file path=customXml/item3.xml><?xml version="1.0" encoding="utf-8"?>
-<p:properties xmlns:p="http://schemas.microsoft.com/office/2006/metadata/properties" xmlns:xsi="http://www.w3.org/2001/XMLSchema-instance" xmlns:pc="http://schemas.microsoft.com/office/infopath/2007/PartnerControls">
-  <documentManagement>
-    <_activity xmlns="67227509-9eb1-40eb-a9dc-2b1f0b440866" xsi:nil="true"/>
-  </documentManagement>
-</p:properties>
-</file>
-
-<file path=customXml/item4.xml><?xml version="1.0" encoding="utf-8"?>
 <ct:contentTypeSchema xmlns:ct="http://schemas.microsoft.com/office/2006/metadata/contentType" xmlns:ma="http://schemas.microsoft.com/office/2006/metadata/properties/metaAttributes" ct:_="" ma:_="" ma:contentTypeName="Document" ma:contentTypeID="0x0101001074AB0691E0C34286CE2CA513530002" ma:contentTypeVersion="15" ma:contentTypeDescription="Create a new document." ma:contentTypeScope="" ma:versionID="f0c759b539abbf0a316c2cd776d6b479">
   <xsd:schema xmlns:xsd="http://www.w3.org/2001/XMLSchema" xmlns:xs="http://www.w3.org/2001/XMLSchema" xmlns:p="http://schemas.microsoft.com/office/2006/metadata/properties" xmlns:ns3="67227509-9eb1-40eb-a9dc-2b1f0b440866" xmlns:ns4="2b030002-75d5-425a-8890-637f4c7b85a2" targetNamespace="http://schemas.microsoft.com/office/2006/metadata/properties" ma:root="true" ma:fieldsID="e278cd2dd81ea2faf464af44bb1ceffd" ns3:_="" ns4:_="">
     <xsd:import namespace="67227509-9eb1-40eb-a9dc-2b1f0b440866"/>
@@ -44776,15 +46707,24 @@
 </ct:contentTypeSchema>
 </file>
 
-<file path=customXml/itemProps1.xml><?xml version="1.0" encoding="utf-8"?>
-<ds:datastoreItem xmlns:ds="http://schemas.openxmlformats.org/officeDocument/2006/customXml" ds:itemID="{63F85671-42FA-431E-8CF5-642144B106FC}">
-  <ds:schemaRefs>
-    <ds:schemaRef ds:uri="http://schemas.microsoft.com/sharepoint/v3/contenttype/forms"/>
-  </ds:schemaRefs>
-</ds:datastoreItem>
+<file path=customXml/item3.xml><?xml version="1.0" encoding="utf-8"?>
+<p:properties xmlns:p="http://schemas.microsoft.com/office/2006/metadata/properties" xmlns:xsi="http://www.w3.org/2001/XMLSchema-instance" xmlns:pc="http://schemas.microsoft.com/office/infopath/2007/PartnerControls">
+  <documentManagement>
+    <_activity xmlns="67227509-9eb1-40eb-a9dc-2b1f0b440866" xsi:nil="true"/>
+  </documentManagement>
+</p:properties>
 </file>
 
-<file path=customXml/itemProps2.xml><?xml version="1.0" encoding="utf-8"?>
+<file path=customXml/item4.xml><?xml version="1.0" encoding="utf-8"?>
+<?mso-contentType ?>
+<FormTemplates xmlns="http://schemas.microsoft.com/sharepoint/v3/contenttype/forms">
+  <Display>DocumentLibraryForm</Display>
+  <Edit>DocumentLibraryForm</Edit>
+  <New>DocumentLibraryForm</New>
+</FormTemplates>
+</file>
+
+<file path=customXml/itemProps1.xml><?xml version="1.0" encoding="utf-8"?>
 <ds:datastoreItem xmlns:ds="http://schemas.openxmlformats.org/officeDocument/2006/customXml" ds:itemID="{576F2EA0-5242-4D4E-994A-0DDDE5F79F7E}">
   <ds:schemaRefs>
     <ds:schemaRef ds:uri="http://schemas.openxmlformats.org/officeDocument/2006/bibliography"/>
@@ -44792,24 +46732,7 @@
 </ds:datastoreItem>
 </file>
 
-<file path=customXml/itemProps3.xml><?xml version="1.0" encoding="utf-8"?>
-<ds:datastoreItem xmlns:ds="http://schemas.openxmlformats.org/officeDocument/2006/customXml" ds:itemID="{91FD62C1-1F9E-4FFF-AD82-34935D97573B}">
-  <ds:schemaRefs>
-    <ds:schemaRef ds:uri="2b030002-75d5-425a-8890-637f4c7b85a2"/>
-    <ds:schemaRef ds:uri="http://purl.org/dc/elements/1.1/"/>
-    <ds:schemaRef ds:uri="http://schemas.microsoft.com/office/2006/documentManagement/types"/>
-    <ds:schemaRef ds:uri="http://schemas.openxmlformats.org/package/2006/metadata/core-properties"/>
-    <ds:schemaRef ds:uri="http://schemas.microsoft.com/office/infopath/2007/PartnerControls"/>
-    <ds:schemaRef ds:uri="67227509-9eb1-40eb-a9dc-2b1f0b440866"/>
-    <ds:schemaRef ds:uri="http://www.w3.org/XML/1998/namespace"/>
-    <ds:schemaRef ds:uri="http://purl.org/dc/dcmitype/"/>
-    <ds:schemaRef ds:uri="http://purl.org/dc/terms/"/>
-    <ds:schemaRef ds:uri="http://schemas.microsoft.com/office/2006/metadata/properties"/>
-  </ds:schemaRefs>
-</ds:datastoreItem>
-</file>
-
-<file path=customXml/itemProps4.xml><?xml version="1.0" encoding="utf-8"?>
+<file path=customXml/itemProps2.xml><?xml version="1.0" encoding="utf-8"?>
 <ds:datastoreItem xmlns:ds="http://schemas.openxmlformats.org/officeDocument/2006/customXml" ds:itemID="{63FE3BEA-40C4-4DEE-A351-0A12CC7F254D}">
   <ds:schemaRefs>
     <ds:schemaRef ds:uri="http://schemas.microsoft.com/office/2006/metadata/contentType"/>
@@ -44826,4 +46749,22 @@
     <ds:schemaRef ds:uri="http://schemas.microsoft.com/internal/obd"/>
   </ds:schemaRefs>
 </ds:datastoreItem>
+</file>
+
+<file path=customXml/itemProps3.xml><?xml version="1.0" encoding="utf-8"?>
+<ds:datastoreItem xmlns:ds="http://schemas.openxmlformats.org/officeDocument/2006/customXml" ds:itemID="{91FD62C1-1F9E-4FFF-AD82-34935D97573B}">
+  <ds:schemaRefs>
+    <ds:schemaRef ds:uri="http://schemas.microsoft.com/office/2006/metadata/properties"/>
+    <ds:schemaRef ds:uri="http://schemas.microsoft.com/office/infopath/2007/PartnerControls"/>
+    <ds:schemaRef ds:uri="67227509-9eb1-40eb-a9dc-2b1f0b440866"/>
+  </ds:schemaRefs>
+</ds:datastoreItem>
+</file>
+
+<file path=customXml/itemProps4.xml><?xml version="1.0" encoding="utf-8"?>
+<ds:datastoreItem xmlns:ds="http://schemas.openxmlformats.org/officeDocument/2006/customXml" ds:itemID="{63F85671-42FA-431E-8CF5-642144B106FC}">
+  <ds:schemaRefs>
+    <ds:schemaRef ds:uri="http://schemas.microsoft.com/sharepoint/v3/contenttype/forms"/>
+  </ds:schemaRefs>
+</ds:datastoreItem>
 </file>
</xml_diff>